<commit_message>
Implement claim consistency checks and enhance decision provider logic. Added new claim mismatch checks for direction and size discrepancies, updated settings for score confidence thresholds, and introduced handling for low confidence scores. Enhanced tests for claim mismatches and decision provider behavior, ensuring accurate flagging and reporting in the justification process.
</commit_message>
<xml_diff>
--- a/docs/Defensible_Demand_Ledger.docx
+++ b/docs/Defensible_Demand_Ledger.docx
@@ -8423,6 +8423,207 @@
     </w:p>
     <w:p>
       <w:pPr>
+        <w:spacing w:after="120"/>
+      </w:pPr>
+      <w:r>
+        <w:rPr>
+          <w:b w:val="0"/>
+          <w:i w:val="0"/>
+        </w:rPr>
+        <w:t>Two further checks compare the structured justification with the number (claim_checks.py). They are shown under the claim while the rep writes and stored as warning flags on submit, so they reach the Ledger and the consensus reasons:</w:t>
+      </w:r>
+    </w:p>
+    <w:p>
+      <w:pPr>
+        <w:spacing w:after="40"/>
+      </w:pPr>
+      <w:r>
+        <w:rPr>
+          <w:b/>
+          <w:sz w:val="18"/>
+        </w:rPr>
+        <w:t>Table 10. Claim-consistency checks</w:t>
+      </w:r>
+    </w:p>
+    <w:tbl>
+      <w:tblPr>
+        <w:tblStyle w:val="LightGrid-Accent1"/>
+        <w:tblW w:type="auto" w:w="0"/>
+        <w:jc w:val="center"/>
+        <w:tblLook w:firstColumn="1" w:firstRow="1" w:lastColumn="0" w:lastRow="0" w:noHBand="0" w:noVBand="1" w:val="04A0"/>
+      </w:tblPr>
+      <w:tblGrid>
+        <w:gridCol w:w="3213"/>
+        <w:gridCol w:w="3213"/>
+        <w:gridCol w:w="3213"/>
+      </w:tblGrid>
+      <w:tr>
+        <w:tc>
+          <w:tcPr>
+            <w:tcW w:type="dxa" w:w="2154"/>
+          </w:tcPr>
+          <w:p>
+            <w:r/>
+            <w:r>
+              <w:rPr>
+                <w:b/>
+                <w:sz w:val="16"/>
+              </w:rPr>
+              <w:t>Code</w:t>
+            </w:r>
+          </w:p>
+        </w:tc>
+        <w:tc>
+          <w:tcPr>
+            <w:tcW w:type="dxa" w:w="4535"/>
+          </w:tcPr>
+          <w:p>
+            <w:r/>
+            <w:r>
+              <w:rPr>
+                <w:b/>
+                <w:sz w:val="16"/>
+              </w:rPr>
+              <w:t>Fires when</w:t>
+            </w:r>
+          </w:p>
+        </w:tc>
+        <w:tc>
+          <w:tcPr>
+            <w:tcW w:type="dxa" w:w="2948"/>
+          </w:tcPr>
+          <w:p>
+            <w:r/>
+            <w:r>
+              <w:rPr>
+                <w:b/>
+                <w:sz w:val="16"/>
+              </w:rPr>
+              <w:t>Example</w:t>
+            </w:r>
+          </w:p>
+        </w:tc>
+      </w:tr>
+      <w:tr>
+        <w:tc>
+          <w:tcPr>
+            <w:tcW w:type="dxa" w:w="2154"/>
+          </w:tcPr>
+          <w:p>
+            <w:r/>
+            <w:r>
+              <w:rPr>
+                <w:b w:val="0"/>
+                <w:i w:val="0"/>
+                <w:sz w:val="16"/>
+              </w:rPr>
+              <w:t>claim_direction_mismatch</w:t>
+            </w:r>
+          </w:p>
+        </w:tc>
+        <w:tc>
+          <w:tcPr>
+            <w:tcW w:type="dxa" w:w="4535"/>
+          </w:tcPr>
+          <w:p>
+            <w:r/>
+            <w:r>
+              <w:rPr>
+                <w:b w:val="0"/>
+                <w:i w:val="0"/>
+                <w:sz w:val="16"/>
+              </w:rPr>
+              <w:t>Jev reads the claim as up (down) but the number is at least 5% below (above) the plan month</w:t>
+            </w:r>
+          </w:p>
+        </w:tc>
+        <w:tc>
+          <w:tcPr>
+            <w:tcW w:type="dxa" w:w="2948"/>
+          </w:tcPr>
+          <w:p>
+            <w:r/>
+            <w:r>
+              <w:rPr>
+                <w:b w:val="0"/>
+                <w:i w:val="0"/>
+                <w:sz w:val="16"/>
+              </w:rPr>
+              <w:t>'Growers are delaying planting' with a number 15% above plan</w:t>
+            </w:r>
+          </w:p>
+        </w:tc>
+      </w:tr>
+      <w:tr>
+        <w:tc>
+          <w:tcPr>
+            <w:tcW w:type="dxa" w:w="2154"/>
+          </w:tcPr>
+          <w:p>
+            <w:r/>
+            <w:r>
+              <w:rPr>
+                <w:b w:val="0"/>
+                <w:i w:val="0"/>
+                <w:sz w:val="16"/>
+              </w:rPr>
+              <w:t>claim_size_mismatch</w:t>
+            </w:r>
+          </w:p>
+        </w:tc>
+        <w:tc>
+          <w:tcPr>
+            <w:tcW w:type="dxa" w:w="4535"/>
+          </w:tcPr>
+          <w:p>
+            <w:r/>
+            <w:r>
+              <w:rPr>
+                <w:b w:val="0"/>
+                <w:i w:val="0"/>
+                <w:sz w:val="16"/>
+              </w:rPr>
+              <w:t>The change vs the plan month is more than 2.5x the upper bound of the size Jev read (negligible 2%, small 5%, moderate 20%), or the rep describes a large effect and the number moves less than 8%</w:t>
+            </w:r>
+          </w:p>
+        </w:tc>
+        <w:tc>
+          <w:tcPr>
+            <w:tcW w:type="dxa" w:w="2948"/>
+          </w:tcPr>
+          <w:p>
+            <w:r/>
+            <w:r>
+              <w:rPr>
+                <w:b w:val="0"/>
+                <w:i w:val="0"/>
+                <w:sz w:val="16"/>
+              </w:rPr>
+              <w:t>A 'small' effect described for a number 900% above plan</w:t>
+            </w:r>
+          </w:p>
+        </w:tc>
+      </w:tr>
+    </w:tbl>
+    <w:p>
+      <w:pPr>
+        <w:spacing w:after="40"/>
+      </w:pPr>
+    </w:p>
+    <w:p>
+      <w:pPr>
+        <w:spacing w:after="120"/>
+      </w:pPr>
+      <w:r>
+        <w:rPr>
+          <w:b w:val="0"/>
+          <w:i w:val="0"/>
+        </w:rPr>
+        <w:t>Competitor shares in the re-split never go below 0%: if Syngenta's implied value would exceed the whole Blocky PGH market, every competitor shows 0% and the share tile says the number exceeds the market.</w:t>
+      </w:r>
+    </w:p>
+    <w:p>
+      <w:pPr>
         <w:pStyle w:val="Heading1"/>
       </w:pPr>
       <w:r>
@@ -8550,7 +8751,7 @@
           <w:b/>
           <w:sz w:val="18"/>
         </w:rPr>
-        <w:t>Table 10. Justification questions</w:t>
+        <w:t>Table 11. Justification questions</w:t>
       </w:r>
     </w:p>
     <w:tbl>
@@ -9325,7 +9526,33 @@
           <w:b w:val="0"/>
           <w:i w:val="0"/>
         </w:rPr>
+        <w:t>Scores (size and specificity) are gated too: confidence below 0.4 (the winning level's probability on a four-level scale) triggers the same Gemini extraction over the level labels.</w:t>
+      </w:r>
+    </w:p>
+    <w:p>
+      <w:pPr>
+        <w:pStyle w:val="ListBullet"/>
+        <w:spacing w:after="40"/>
+      </w:pPr>
+      <w:r>
+        <w:rPr>
+          <w:b w:val="0"/>
+          <w:i w:val="0"/>
+        </w:rPr>
         <w:t>If Gemini fails or times out, Jev's answer is kept and the field is reported as low-confidence to the rep.</w:t>
+      </w:r>
+    </w:p>
+    <w:p>
+      <w:pPr>
+        <w:pStyle w:val="ListBullet"/>
+        <w:spacing w:after="40"/>
+      </w:pPr>
+      <w:r>
+        <w:rPr>
+          <w:b w:val="0"/>
+          <w:i w:val="0"/>
+        </w:rPr>
+        <w:t>Yes/no answers between 40% and 60% are shown as 'Uncertain' rather than Yes or No.</w:t>
       </w:r>
     </w:p>
     <w:p>
@@ -9419,7 +9646,7 @@
           <w:b/>
           <w:sz w:val="18"/>
         </w:rPr>
-        <w:t>Table 11. Resolution</w:t>
+        <w:t>Table 12. Resolution</w:t>
       </w:r>
     </w:p>
     <w:tbl>
@@ -9713,7 +9940,7 @@
           <w:b/>
           <w:sz w:val="18"/>
         </w:rPr>
-        <w:t>Table 12. AI modes</w:t>
+        <w:t>Table 13. AI modes</w:t>
       </w:r>
     </w:p>
     <w:tbl>
@@ -9923,7 +10150,7 @@
           <w:b/>
           <w:sz w:val="18"/>
         </w:rPr>
-        <w:t>Table 13. Workbooks and tabs</w:t>
+        <w:t>Table 14. Workbooks and tabs</w:t>
       </w:r>
     </w:p>
     <w:tbl>
@@ -10689,7 +10916,7 @@
           <w:b/>
           <w:sz w:val="18"/>
         </w:rPr>
-        <w:t>Table 14. Market elements used</w:t>
+        <w:t>Table 15. Market elements used</w:t>
       </w:r>
     </w:p>
     <w:tbl>
@@ -11474,7 +11701,7 @@
           <w:b/>
           <w:sz w:val="18"/>
         </w:rPr>
-        <w:t>Table 15. Sales elements used</w:t>
+        <w:t>Table 16. Sales elements used</w:t>
       </w:r>
     </w:p>
     <w:tbl>
@@ -12009,7 +12236,7 @@
           <w:b/>
           <w:sz w:val="18"/>
         </w:rPr>
-        <w:t>Table 16. Competitor elements used</w:t>
+        <w:t>Table 17. Competitor elements used</w:t>
       </w:r>
     </w:p>
     <w:tbl>
@@ -12344,7 +12571,7 @@
           <w:b/>
           <w:sz w:val="18"/>
         </w:rPr>
-        <w:t>Table 17. Grower-potential elements used</w:t>
+        <w:t>Table 18. Grower-potential elements used</w:t>
       </w:r>
     </w:p>
     <w:tbl>
@@ -12829,7 +13056,7 @@
           <w:b/>
           <w:sz w:val="18"/>
         </w:rPr>
-        <w:t>Table 18. Hierarchy elements used (tab: prod hierarchy)</w:t>
+        <w:t>Table 19. Hierarchy elements used (tab: prod hierarchy)</w:t>
       </w:r>
     </w:p>
     <w:tbl>
@@ -13264,7 +13491,7 @@
           <w:b/>
           <w:sz w:val="18"/>
         </w:rPr>
-        <w:t>Table 19. Geo elements used</w:t>
+        <w:t>Table 20. Geo elements used</w:t>
       </w:r>
     </w:p>
     <w:tbl>
@@ -13449,7 +13676,7 @@
           <w:b/>
           <w:sz w:val="18"/>
         </w:rPr>
-        <w:t>Table 20. Unused columns and why</w:t>
+        <w:t>Table 21. Unused columns and why</w:t>
       </w:r>
     </w:p>
     <w:tbl>
@@ -13834,7 +14061,7 @@
           <w:b/>
           <w:sz w:val="18"/>
         </w:rPr>
-        <w:t>Table 21. Data-quality findings (from ingest_report.json)</w:t>
+        <w:t>Table 22. Data-quality findings (from ingest_report.json)</w:t>
       </w:r>
     </w:p>
     <w:tbl>
@@ -14581,7 +14808,7 @@
           <w:b/>
           <w:sz w:val="18"/>
         </w:rPr>
-        <w:t>Table 22. Synthetic layers</w:t>
+        <w:t>Table 23. Synthetic layers</w:t>
       </w:r>
     </w:p>
     <w:tbl>
@@ -15016,7 +15243,7 @@
           <w:b/>
           <w:sz w:val="18"/>
         </w:rPr>
-        <w:t>Table 23. Derived elements</w:t>
+        <w:t>Table 24. Derived elements</w:t>
       </w:r>
     </w:p>
     <w:tbl>
@@ -15556,7 +15783,7 @@
           <w:b/>
           <w:sz w:val="18"/>
         </w:rPr>
-        <w:t>Table 24. Tables (one Alembic migration)</w:t>
+        <w:t>Table 25. Tables (one Alembic migration)</w:t>
       </w:r>
     </w:p>
     <w:tbl>
@@ -16191,7 +16418,7 @@
           <w:b/>
           <w:sz w:val="18"/>
         </w:rPr>
-        <w:t>Table 25. Endpoints</w:t>
+        <w:t>Table 26. Endpoints</w:t>
       </w:r>
     </w:p>
     <w:tbl>
@@ -17026,7 +17253,7 @@
           <w:b/>
           <w:sz w:val="18"/>
         </w:rPr>
-        <w:t>Table 26. Production configuration</w:t>
+        <w:t>Table 27. Production configuration</w:t>
       </w:r>
     </w:p>
     <w:tbl>
@@ -17414,14 +17641,14 @@
           <w:b/>
           <w:i w:val="0"/>
         </w:rPr>
-        <w:t>Backend (pytest, 25 tests)</w:t>
+        <w:t>Backend (pytest, 37 tests)</w:t>
       </w:r>
       <w:r>
         <w:rPr>
           <w:b w:val="0"/>
           <w:i w:val="0"/>
         </w:rPr>
-        <w:t>: golden math cases, flag rules, decision provider (offline, recorded fixture, live mocked, Jev failure, low-confidence, Gemini fallback and summary), full API loop (flag enforcement, ownership, closed months, supersede, consensus, advance, CSV, RTB, track records, reset, data quality).</w:t>
+        <w:t>: golden math cases, flag rules, claim-consistency checks, decision provider (offline, recorded fixture, live mocked, Jev failure, low-confidence, Gemini fallback and summary), full API loop (flag enforcement, ownership, closed months, supersede, consensus, advance, CSV, RTB, track records, reset, data quality).</w:t>
       </w:r>
     </w:p>
     <w:p>
@@ -17434,7 +17661,7 @@
           <w:b/>
           <w:i w:val="0"/>
         </w:rPr>
-        <w:t>Frontend (vitest, 18 tests)</w:t>
+        <w:t>Frontend (vitest, 22 tests)</w:t>
       </w:r>
       <w:r>
         <w:rPr>
@@ -17501,7 +17728,7 @@
           <w:b/>
           <w:sz w:val="18"/>
         </w:rPr>
-        <w:t>Table 27. Limitations and next steps</w:t>
+        <w:t>Table 28. Limitations and next steps</w:t>
       </w:r>
     </w:p>
     <w:tbl>
@@ -18035,7 +18262,7 @@
           <w:b/>
           <w:sz w:val="18"/>
         </w:rPr>
-        <w:t>Table 28. Terms</w:t>
+        <w:t>Table 29. Terms</w:t>
       </w:r>
     </w:p>
     <w:tbl>

</xml_diff>

<commit_message>
Enhance Skystream project with new features and improvements. Updated CLAUDE.md and README.md to clarify project modes and usage instructions. Added support for Firebase authentication and improved data handling in real mode. Introduced new country dimension in database schema and updated backend configurations. Enhanced decision provider logic with a new policy system for AI interactions. Updated dependencies in pyproject.toml and package-lock.json for better compatibility.
</commit_message>
<xml_diff>
--- a/docs/Defensible_Demand_Ledger.docx
+++ b/docs/Defensible_Demand_Ledger.docx
@@ -4254,7 +4254,7 @@
       <w:r>
         <w:drawing>
           <wp:inline xmlns:a="http://schemas.openxmlformats.org/drawingml/2006/main" xmlns:pic="http://schemas.openxmlformats.org/drawingml/2006/picture">
-            <wp:extent cx="6120000" cy="5087250"/>
+            <wp:extent cx="6120000" cy="5265750"/>
             <wp:docPr id="1" name="Picture 1"/>
             <wp:cNvGraphicFramePr>
               <a:graphicFrameLocks noChangeAspect="1"/>
@@ -4275,7 +4275,7 @@
                   <pic:spPr>
                     <a:xfrm>
                       <a:off x="0" y="0"/>
-                      <a:ext cx="6120000" cy="5087250"/>
+                      <a:ext cx="6120000" cy="5265750"/>
                     </a:xfrm>
                     <a:prstGeom prst="rect"/>
                   </pic:spPr>
@@ -4500,7 +4500,7 @@
       <w:r>
         <w:drawing>
           <wp:inline xmlns:a="http://schemas.openxmlformats.org/drawingml/2006/main" xmlns:pic="http://schemas.openxmlformats.org/drawingml/2006/picture">
-            <wp:extent cx="6120000" cy="5172250"/>
+            <wp:extent cx="6120000" cy="5350750"/>
             <wp:docPr id="2" name="Picture 2"/>
             <wp:cNvGraphicFramePr>
               <a:graphicFrameLocks noChangeAspect="1"/>
@@ -4521,7 +4521,7 @@
                   <pic:spPr>
                     <a:xfrm>
                       <a:off x="0" y="0"/>
-                      <a:ext cx="6120000" cy="5172250"/>
+                      <a:ext cx="6120000" cy="5350750"/>
                     </a:xfrm>
                     <a:prstGeom prst="rect"/>
                   </pic:spPr>
@@ -4584,7 +4584,7 @@
       <w:r>
         <w:drawing>
           <wp:inline xmlns:a="http://schemas.openxmlformats.org/drawingml/2006/main" xmlns:pic="http://schemas.openxmlformats.org/drawingml/2006/picture">
-            <wp:extent cx="6120000" cy="6107250"/>
+            <wp:extent cx="6120000" cy="6290000"/>
             <wp:docPr id="3" name="Picture 3"/>
             <wp:cNvGraphicFramePr>
               <a:graphicFrameLocks noChangeAspect="1"/>
@@ -4605,7 +4605,7 @@
                   <pic:spPr>
                     <a:xfrm>
                       <a:off x="0" y="0"/>
-                      <a:ext cx="6120000" cy="6107250"/>
+                      <a:ext cx="6120000" cy="6290000"/>
                     </a:xfrm>
                     <a:prstGeom prst="rect"/>
                   </pic:spPr>
@@ -4933,7 +4933,7 @@
       <w:r>
         <w:drawing>
           <wp:inline xmlns:a="http://schemas.openxmlformats.org/drawingml/2006/main" xmlns:pic="http://schemas.openxmlformats.org/drawingml/2006/picture">
-            <wp:extent cx="6120000" cy="5410250"/>
+            <wp:extent cx="6120000" cy="5503750"/>
             <wp:docPr id="6" name="Picture 6"/>
             <wp:cNvGraphicFramePr>
               <a:graphicFrameLocks noChangeAspect="1"/>
@@ -4954,7 +4954,7 @@
                   <pic:spPr>
                     <a:xfrm>
                       <a:off x="0" y="0"/>
-                      <a:ext cx="6120000" cy="5410250"/>
+                      <a:ext cx="6120000" cy="5503750"/>
                     </a:xfrm>
                     <a:prstGeom prst="rect"/>
                   </pic:spPr>
@@ -5004,7 +5004,7 @@
       <w:r>
         <w:drawing>
           <wp:inline xmlns:a="http://schemas.openxmlformats.org/drawingml/2006/main" xmlns:pic="http://schemas.openxmlformats.org/drawingml/2006/picture">
-            <wp:extent cx="6120000" cy="4611250"/>
+            <wp:extent cx="6120000" cy="6077500"/>
             <wp:docPr id="7" name="Picture 7"/>
             <wp:cNvGraphicFramePr>
               <a:graphicFrameLocks noChangeAspect="1"/>
@@ -5025,7 +5025,7 @@
                   <pic:spPr>
                     <a:xfrm>
                       <a:off x="0" y="0"/>
-                      <a:ext cx="6120000" cy="4611250"/>
+                      <a:ext cx="6120000" cy="6077500"/>
                     </a:xfrm>
                     <a:prstGeom prst="rect"/>
                   </pic:spPr>
@@ -17641,7 +17641,7 @@
           <w:b/>
           <w:i w:val="0"/>
         </w:rPr>
-        <w:t>Backend (pytest, 37 tests)</w:t>
+        <w:t>Backend (pytest, 55 tests)</w:t>
       </w:r>
       <w:r>
         <w:rPr>
@@ -17661,7 +17661,7 @@
           <w:b/>
           <w:i w:val="0"/>
         </w:rPr>
-        <w:t>Frontend (vitest, 22 tests)</w:t>
+        <w:t>Frontend (vitest, 24 tests)</w:t>
       </w:r>
       <w:r>
         <w:rPr>
@@ -17716,7 +17716,19 @@
         <w:pStyle w:val="Heading1"/>
       </w:pPr>
       <w:r>
-        <w:t>21. Limitations, risks and next steps</w:t>
+        <w:t>21. Real-figures mode</w:t>
+      </w:r>
+    </w:p>
+    <w:p>
+      <w:pPr>
+        <w:spacing w:after="120"/>
+      </w:pPr>
+      <w:r>
+        <w:rPr>
+          <w:b w:val="0"/>
+          <w:i w:val="0"/>
+        </w:rPr>
+        <w:t>The same application runs on real figures at https://skystream-real-842137351485.europe-west1.run.app (Cloud Run europe-west1, Cloud SQL Postgres). Demo mode keeps the anonymized seed; real mode only shows what admins upload, for any country and crop.</w:t>
       </w:r>
     </w:p>
     <w:p>
@@ -17728,7 +17740,7 @@
           <w:b/>
           <w:sz w:val="18"/>
         </w:rPr>
-        <w:t>Table 28. Limitations and next steps</w:t>
+        <w:t>Table 28. Modes</w:t>
       </w:r>
     </w:p>
     <w:tbl>
@@ -17753,39 +17765,38 @@
             <w:r>
               <w:rPr>
                 <w:b/>
-                <w:sz w:val="16"/>
-              </w:rPr>
-              <w:t>Area</w:t>
-            </w:r>
-          </w:p>
-        </w:tc>
-        <w:tc>
-          <w:tcPr>
-            <w:tcW w:type="dxa" w:w="3969"/>
+                <w:sz w:val="17"/>
+              </w:rPr>
+            </w:r>
+          </w:p>
+        </w:tc>
+        <w:tc>
+          <w:tcPr>
+            <w:tcW w:type="dxa" w:w="3685"/>
           </w:tcPr>
           <w:p>
             <w:r/>
             <w:r>
               <w:rPr>
                 <w:b/>
-                <w:sz w:val="16"/>
-              </w:rPr>
-              <w:t>Current state</w:t>
-            </w:r>
-          </w:p>
-        </w:tc>
-        <w:tc>
-          <w:tcPr>
-            <w:tcW w:type="dxa" w:w="3969"/>
+                <w:sz w:val="17"/>
+              </w:rPr>
+              <w:t>Demo</w:t>
+            </w:r>
+          </w:p>
+        </w:tc>
+        <w:tc>
+          <w:tcPr>
+            <w:tcW w:type="dxa" w:w="4252"/>
           </w:tcPr>
           <w:p>
             <w:r/>
             <w:r>
               <w:rPr>
                 <w:b/>
-                <w:sz w:val="16"/>
-              </w:rPr>
-              <w:t>Next step</w:t>
+                <w:sz w:val="17"/>
+              </w:rPr>
+              <w:t>Real</w:t>
             </w:r>
           </w:p>
         </w:tc>
@@ -17801,41 +17812,41 @@
               <w:rPr>
                 <w:b w:val="0"/>
                 <w:i w:val="0"/>
-                <w:sz w:val="16"/>
-              </w:rPr>
-              <w:t>Authentication</w:t>
-            </w:r>
-          </w:p>
-        </w:tc>
-        <w:tc>
-          <w:tcPr>
-            <w:tcW w:type="dxa" w:w="3969"/>
-          </w:tcPr>
-          <w:p>
-            <w:r/>
-            <w:r>
-              <w:rPr>
-                <w:b w:val="0"/>
-                <w:i w:val="0"/>
-                <w:sz w:val="16"/>
-              </w:rPr>
-              <w:t>Role switcher via header</w:t>
-            </w:r>
-          </w:p>
-        </w:tc>
-        <w:tc>
-          <w:tcPr>
-            <w:tcW w:type="dxa" w:w="3969"/>
-          </w:tcPr>
-          <w:p>
-            <w:r/>
-            <w:r>
-              <w:rPr>
-                <w:b w:val="0"/>
-                <w:i w:val="0"/>
-                <w:sz w:val="16"/>
-              </w:rPr>
-              <w:t>Firebase Auth / SSO with role claims</w:t>
+                <w:sz w:val="17"/>
+              </w:rPr>
+              <w:t>Figures</w:t>
+            </w:r>
+          </w:p>
+        </w:tc>
+        <w:tc>
+          <w:tcPr>
+            <w:tcW w:type="dxa" w:w="3685"/>
+          </w:tcPr>
+          <w:p>
+            <w:r/>
+            <w:r>
+              <w:rPr>
+                <w:b w:val="0"/>
+                <w:i w:val="0"/>
+                <w:sz w:val="17"/>
+              </w:rPr>
+              <w:t>Anonymized seed, Spain &gt; Sweet Pepper &gt; Blocky PGH</w:t>
+            </w:r>
+          </w:p>
+        </w:tc>
+        <w:tc>
+          <w:tcPr>
+            <w:tcW w:type="dxa" w:w="4252"/>
+          </w:tcPr>
+          <w:p>
+            <w:r/>
+            <w:r>
+              <w:rPr>
+                <w:b w:val="0"/>
+                <w:i w:val="0"/>
+                <w:sz w:val="17"/>
+              </w:rPr>
+              <w:t>Admin uploads, any country / mega-segment</w:t>
             </w:r>
           </w:p>
         </w:tc>
@@ -17851,41 +17862,41 @@
               <w:rPr>
                 <w:b w:val="0"/>
                 <w:i w:val="0"/>
-                <w:sz w:val="16"/>
-              </w:rPr>
-              <w:t>Persistence</w:t>
-            </w:r>
-          </w:p>
-        </w:tc>
-        <w:tc>
-          <w:tcPr>
-            <w:tcW w:type="dxa" w:w="3969"/>
-          </w:tcPr>
-          <w:p>
-            <w:r/>
-            <w:r>
-              <w:rPr>
-                <w:b w:val="0"/>
-                <w:i w:val="0"/>
-                <w:sz w:val="16"/>
-              </w:rPr>
-              <w:t>SQLite per Cloud Run instance, reset on cold start; brief inconsistency possible if a second instance starts</w:t>
-            </w:r>
-          </w:p>
-        </w:tc>
-        <w:tc>
-          <w:tcPr>
-            <w:tcW w:type="dxa" w:w="3969"/>
-          </w:tcPr>
-          <w:p>
-            <w:r/>
-            <w:r>
-              <w:rPr>
-                <w:b w:val="0"/>
-                <w:i w:val="0"/>
-                <w:sz w:val="16"/>
-              </w:rPr>
-              <w:t>Cloud SQL Postgres (already supported) or min-instances=1</w:t>
+                <w:sz w:val="17"/>
+              </w:rPr>
+              <w:t>Sign-in</w:t>
+            </w:r>
+          </w:p>
+        </w:tc>
+        <w:tc>
+          <w:tcPr>
+            <w:tcW w:type="dxa" w:w="3685"/>
+          </w:tcPr>
+          <w:p>
+            <w:r/>
+            <w:r>
+              <w:rPr>
+                <w:b w:val="0"/>
+                <w:i w:val="0"/>
+                <w:sz w:val="17"/>
+              </w:rPr>
+              <w:t>Role switcher</w:t>
+            </w:r>
+          </w:p>
+        </w:tc>
+        <w:tc>
+          <w:tcPr>
+            <w:tcW w:type="dxa" w:w="4252"/>
+          </w:tcPr>
+          <w:p>
+            <w:r/>
+            <w:r>
+              <w:rPr>
+                <w:b w:val="0"/>
+                <w:i w:val="0"/>
+                <w:sz w:val="17"/>
+              </w:rPr>
+              <w:t>Firebase Google sign-in; only registered, active users</w:t>
             </w:r>
           </w:p>
         </w:tc>
@@ -17901,41 +17912,41 @@
               <w:rPr>
                 <w:b w:val="0"/>
                 <w:i w:val="0"/>
-                <w:sz w:val="16"/>
-              </w:rPr>
-              <w:t>Monthly data</w:t>
-            </w:r>
-          </w:p>
-        </w:tc>
-        <w:tc>
-          <w:tcPr>
-            <w:tcW w:type="dxa" w:w="3969"/>
-          </w:tcPr>
-          <w:p>
-            <w:r/>
-            <w:r>
-              <w:rPr>
-                <w:b w:val="0"/>
-                <w:i w:val="0"/>
-                <w:sz w:val="16"/>
-              </w:rPr>
-              <w:t>Synthetic curves and actuals</w:t>
-            </w:r>
-          </w:p>
-        </w:tc>
-        <w:tc>
-          <w:tcPr>
-            <w:tcW w:type="dxa" w:w="3969"/>
-          </w:tcPr>
-          <w:p>
-            <w:r/>
-            <w:r>
-              <w:rPr>
-                <w:b w:val="0"/>
-                <w:i w:val="0"/>
-                <w:sz w:val="16"/>
-              </w:rPr>
-              <w:t>Confirm seasonality; load real monthly demand and year-to-date actuals</w:t>
+                <w:sz w:val="17"/>
+              </w:rPr>
+              <w:t>Access</w:t>
+            </w:r>
+          </w:p>
+        </w:tc>
+        <w:tc>
+          <w:tcPr>
+            <w:tcW w:type="dxa" w:w="3685"/>
+          </w:tcPr>
+          <w:p>
+            <w:r/>
+            <w:r>
+              <w:rPr>
+                <w:b w:val="0"/>
+                <w:i w:val="0"/>
+                <w:sz w:val="17"/>
+              </w:rPr>
+              <w:t>Seeded owners</w:t>
+            </w:r>
+          </w:p>
+        </w:tc>
+        <w:tc>
+          <w:tcPr>
+            <w:tcW w:type="dxa" w:w="4252"/>
+          </w:tcPr>
+          <w:p>
+            <w:r/>
+            <w:r>
+              <w:rPr>
+                <w:b w:val="0"/>
+                <w:i w:val="0"/>
+                <w:sz w:val="17"/>
+              </w:rPr>
+              <w:t>user_scopes: country + mega-segment or micro-segment per rep</w:t>
             </w:r>
           </w:p>
         </w:tc>
@@ -17951,41 +17962,41 @@
               <w:rPr>
                 <w:b w:val="0"/>
                 <w:i w:val="0"/>
-                <w:sz w:val="16"/>
-              </w:rPr>
-              <w:t>Claim signals</w:t>
-            </w:r>
-          </w:p>
-        </w:tc>
-        <w:tc>
-          <w:tcPr>
-            <w:tcW w:type="dxa" w:w="3969"/>
-          </w:tcPr>
-          <w:p>
-            <w:r/>
-            <w:r>
-              <w:rPr>
-                <w:b w:val="0"/>
-                <w:i w:val="0"/>
-                <w:sz w:val="16"/>
-              </w:rPr>
-              <w:t>Competitor and hectare claims checked against monthly sales</w:t>
-            </w:r>
-          </w:p>
-        </w:tc>
-        <w:tc>
-          <w:tcPr>
-            <w:tcW w:type="dxa" w:w="3969"/>
-          </w:tcPr>
-          <w:p>
-            <w:r/>
-            <w:r>
-              <w:rPr>
-                <w:b w:val="0"/>
-                <w:i w:val="0"/>
-                <w:sz w:val="16"/>
-              </w:rPr>
-              <w:t>Add competitor-share and MAPA/ESYRCE hectare feeds</w:t>
+                <w:sz w:val="17"/>
+              </w:rPr>
+              <w:t>Calendar</w:t>
+            </w:r>
+          </w:p>
+        </w:tc>
+        <w:tc>
+          <w:tcPr>
+            <w:tcW w:type="dxa" w:w="3685"/>
+          </w:tcPr>
+          <w:p>
+            <w:r/>
+            <w:r>
+              <w:rPr>
+                <w:b w:val="0"/>
+                <w:i w:val="0"/>
+                <w:sz w:val="17"/>
+              </w:rPr>
+              <w:t>Advance month button</w:t>
+            </w:r>
+          </w:p>
+        </w:tc>
+        <w:tc>
+          <w:tcPr>
+            <w:tcW w:type="dxa" w:w="4252"/>
+          </w:tcPr>
+          <w:p>
+            <w:r/>
+            <w:r>
+              <w:rPr>
+                <w:b w:val="0"/>
+                <w:i w:val="0"/>
+                <w:sz w:val="17"/>
+              </w:rPr>
+              <w:t>A month closes when its actuals are uploaded</w:t>
             </w:r>
           </w:p>
         </w:tc>
@@ -18001,41 +18012,41 @@
               <w:rPr>
                 <w:b w:val="0"/>
                 <w:i w:val="0"/>
-                <w:sz w:val="16"/>
-              </w:rPr>
-              <w:t>Jev</w:t>
-            </w:r>
-          </w:p>
-        </w:tc>
-        <w:tc>
-          <w:tcPr>
-            <w:tcW w:type="dxa" w:w="3969"/>
-          </w:tcPr>
-          <w:p>
-            <w:r/>
-            <w:r>
-              <w:rPr>
-                <w:b w:val="0"/>
-                <w:i w:val="0"/>
-                <w:sz w:val="16"/>
-              </w:rPr>
-              <w:t>Early-access model; confidence gating + Gemini fallback + offline decider</w:t>
-            </w:r>
-          </w:p>
-        </w:tc>
-        <w:tc>
-          <w:tcPr>
-            <w:tcW w:type="dxa" w:w="3969"/>
-          </w:tcPr>
-          <w:p>
-            <w:r/>
-            <w:r>
-              <w:rPr>
-                <w:b w:val="0"/>
-                <w:i w:val="0"/>
-                <w:sz w:val="16"/>
-              </w:rPr>
-              <w:t>Record fixtures for demos; tune option wording and 0.8 threshold on labelled examples</w:t>
+                <w:sz w:val="17"/>
+              </w:rPr>
+              <w:t>Storage</w:t>
+            </w:r>
+          </w:p>
+        </w:tc>
+        <w:tc>
+          <w:tcPr>
+            <w:tcW w:type="dxa" w:w="3685"/>
+          </w:tcPr>
+          <w:p>
+            <w:r/>
+            <w:r>
+              <w:rPr>
+                <w:b w:val="0"/>
+                <w:i w:val="0"/>
+                <w:sz w:val="17"/>
+              </w:rPr>
+              <w:t>SQLite per instance</w:t>
+            </w:r>
+          </w:p>
+        </w:tc>
+        <w:tc>
+          <w:tcPr>
+            <w:tcW w:type="dxa" w:w="4252"/>
+          </w:tcPr>
+          <w:p>
+            <w:r/>
+            <w:r>
+              <w:rPr>
+                <w:b w:val="0"/>
+                <w:i w:val="0"/>
+                <w:sz w:val="17"/>
+              </w:rPr>
+              <w:t>Cloud SQL Postgres (skystream-pg)</w:t>
             </w:r>
           </w:p>
         </w:tc>
@@ -18051,91 +18062,41 @@
               <w:rPr>
                 <w:b w:val="0"/>
                 <w:i w:val="0"/>
-                <w:sz w:val="16"/>
-              </w:rPr>
-              <w:t>Thresholds</w:t>
-            </w:r>
-          </w:p>
-        </w:tc>
-        <w:tc>
-          <w:tcPr>
-            <w:tcW w:type="dxa" w:w="3969"/>
-          </w:tcPr>
-          <w:p>
-            <w:r/>
-            <w:r>
-              <w:rPr>
-                <w:b w:val="0"/>
-                <w:i w:val="0"/>
-                <w:sz w:val="16"/>
-              </w:rPr>
-              <w:t>Defaults (10 pts, 2 sigma, 30% range, 70% price share)</w:t>
-            </w:r>
-          </w:p>
-        </w:tc>
-        <w:tc>
-          <w:tcPr>
-            <w:tcW w:type="dxa" w:w="3969"/>
-          </w:tcPr>
-          <w:p>
-            <w:r/>
-            <w:r>
-              <w:rPr>
-                <w:b w:val="0"/>
-                <w:i w:val="0"/>
-                <w:sz w:val="16"/>
-              </w:rPr>
-              <w:t>Calibrate with the SMEs</w:t>
-            </w:r>
-          </w:p>
-        </w:tc>
-      </w:tr>
-      <w:tr>
-        <w:tc>
-          <w:tcPr>
-            <w:tcW w:type="dxa" w:w="1701"/>
-          </w:tcPr>
-          <w:p>
-            <w:r/>
-            <w:r>
-              <w:rPr>
-                <w:b w:val="0"/>
-                <w:i w:val="0"/>
-                <w:sz w:val="16"/>
-              </w:rPr>
-              <w:t>Scope</w:t>
-            </w:r>
-          </w:p>
-        </w:tc>
-        <w:tc>
-          <w:tcPr>
-            <w:tcW w:type="dxa" w:w="3969"/>
-          </w:tcPr>
-          <w:p>
-            <w:r/>
-            <w:r>
-              <w:rPr>
-                <w:b w:val="0"/>
-                <w:i w:val="0"/>
-                <w:sz w:val="16"/>
-              </w:rPr>
-              <w:t>One crop, one country</w:t>
-            </w:r>
-          </w:p>
-        </w:tc>
-        <w:tc>
-          <w:tcPr>
-            <w:tcW w:type="dxa" w:w="3969"/>
-          </w:tcPr>
-          <w:p>
-            <w:r/>
-            <w:r>
-              <w:rPr>
-                <w:b w:val="0"/>
-                <w:i w:val="0"/>
-                <w:sz w:val="16"/>
-              </w:rPr>
-              <w:t>Territory roll-up and more crops after the MVP</w:t>
+                <w:sz w:val="17"/>
+              </w:rPr>
+              <w:t>Jev</w:t>
+            </w:r>
+          </w:p>
+        </w:tc>
+        <w:tc>
+          <w:tcPr>
+            <w:tcW w:type="dxa" w:w="3685"/>
+          </w:tcPr>
+          <w:p>
+            <w:r/>
+            <w:r>
+              <w:rPr>
+                <w:b w:val="0"/>
+                <w:i w:val="0"/>
+                <w:sz w:val="17"/>
+              </w:rPr>
+              <w:t>Allowed</w:t>
+            </w:r>
+          </w:p>
+        </w:tc>
+        <w:tc>
+          <w:tcPr>
+            <w:tcW w:type="dxa" w:w="4252"/>
+          </w:tcPr>
+          <w:p>
+            <w:r/>
+            <w:r>
+              <w:rPr>
+                <w:b w:val="0"/>
+                <w:i w:val="0"/>
+                <w:sz w:val="17"/>
+              </w:rPr>
+              <w:t>Off until an admin enables it after clearance; Gemini/offline meanwhile</w:t>
             </w:r>
           </w:p>
         </w:tc>
@@ -18151,7 +18112,1321 @@
         <w:pStyle w:val="Heading2"/>
       </w:pPr>
       <w:r>
-        <w:t>21.1 Open questions for the SMEs</w:t>
+        <w:t>21.1 Inputs the admin provides</w:t>
+      </w:r>
+    </w:p>
+    <w:p>
+      <w:pPr>
+        <w:spacing w:after="40"/>
+      </w:pPr>
+      <w:r>
+        <w:rPr>
+          <w:b/>
+          <w:sz w:val="18"/>
+        </w:rPr>
+        <w:t>Table 29. Uploads, in load order</w:t>
+      </w:r>
+    </w:p>
+    <w:tbl>
+      <w:tblPr>
+        <w:tblStyle w:val="LightGrid-Accent1"/>
+        <w:tblW w:type="auto" w:w="0"/>
+        <w:jc w:val="center"/>
+        <w:tblLook w:firstColumn="1" w:firstRow="1" w:lastColumn="0" w:lastRow="0" w:noHBand="0" w:noVBand="1" w:val="04A0"/>
+      </w:tblPr>
+      <w:tblGrid>
+        <w:gridCol w:w="1928"/>
+        <w:gridCol w:w="1928"/>
+        <w:gridCol w:w="1928"/>
+        <w:gridCol w:w="1928"/>
+        <w:gridCol w:w="1928"/>
+      </w:tblGrid>
+      <w:tr>
+        <w:tc>
+          <w:tcPr>
+            <w:tcW w:type="dxa" w:w="340"/>
+          </w:tcPr>
+          <w:p>
+            <w:r/>
+            <w:r>
+              <w:rPr>
+                <w:b/>
+                <w:sz w:val="15"/>
+              </w:rPr>
+              <w:t>#</w:t>
+            </w:r>
+          </w:p>
+        </w:tc>
+        <w:tc>
+          <w:tcPr>
+            <w:tcW w:type="dxa" w:w="1701"/>
+          </w:tcPr>
+          <w:p>
+            <w:r/>
+            <w:r>
+              <w:rPr>
+                <w:b/>
+                <w:sz w:val="15"/>
+              </w:rPr>
+              <w:t>File</w:t>
+            </w:r>
+          </w:p>
+        </w:tc>
+        <w:tc>
+          <w:tcPr>
+            <w:tcW w:type="dxa" w:w="1361"/>
+          </w:tcPr>
+          <w:p>
+            <w:r/>
+            <w:r>
+              <w:rPr>
+                <w:b/>
+                <w:sz w:val="15"/>
+              </w:rPr>
+              <w:t>Format</w:t>
+            </w:r>
+          </w:p>
+        </w:tc>
+        <w:tc>
+          <w:tcPr>
+            <w:tcW w:type="dxa" w:w="3402"/>
+          </w:tcPr>
+          <w:p>
+            <w:r/>
+            <w:r>
+              <w:rPr>
+                <w:b/>
+                <w:sz w:val="15"/>
+              </w:rPr>
+              <w:t>Required columns</w:t>
+            </w:r>
+          </w:p>
+        </w:tc>
+        <w:tc>
+          <w:tcPr>
+            <w:tcW w:type="dxa" w:w="2835"/>
+          </w:tcPr>
+          <w:p>
+            <w:r/>
+            <w:r>
+              <w:rPr>
+                <w:b/>
+                <w:sz w:val="15"/>
+              </w:rPr>
+              <w:t>Behaviour</w:t>
+            </w:r>
+          </w:p>
+        </w:tc>
+      </w:tr>
+      <w:tr>
+        <w:tc>
+          <w:tcPr>
+            <w:tcW w:type="dxa" w:w="340"/>
+          </w:tcPr>
+          <w:p>
+            <w:r/>
+            <w:r>
+              <w:rPr>
+                <w:b w:val="0"/>
+                <w:i w:val="0"/>
+                <w:sz w:val="15"/>
+              </w:rPr>
+              <w:t>1</w:t>
+            </w:r>
+          </w:p>
+        </w:tc>
+        <w:tc>
+          <w:tcPr>
+            <w:tcW w:type="dxa" w:w="1701"/>
+          </w:tcPr>
+          <w:p>
+            <w:r/>
+            <w:r>
+              <w:rPr>
+                <w:b w:val="0"/>
+                <w:i w:val="0"/>
+                <w:sz w:val="15"/>
+              </w:rPr>
+              <w:t>Product hierarchy</w:t>
+            </w:r>
+          </w:p>
+        </w:tc>
+        <w:tc>
+          <w:tcPr>
+            <w:tcW w:type="dxa" w:w="1361"/>
+          </w:tcPr>
+          <w:p>
+            <w:r/>
+            <w:r>
+              <w:rPr>
+                <w:b w:val="0"/>
+                <w:i w:val="0"/>
+                <w:sz w:val="15"/>
+              </w:rPr>
+              <w:t>xlsx tab 'prod hierarchy' or csv</w:t>
+            </w:r>
+          </w:p>
+        </w:tc>
+        <w:tc>
+          <w:tcPr>
+            <w:tcW w:type="dxa" w:w="3402"/>
+          </w:tcPr>
+          <w:p>
+            <w:r/>
+            <w:r>
+              <w:rPr>
+                <w:b w:val="0"/>
+                <w:i w:val="0"/>
+                <w:sz w:val="15"/>
+              </w:rPr>
+              <w:t>f_specie, f_megaSegment, f_megaSegmentDesc, f_microSegment, f_microSegmentDesc</w:t>
+            </w:r>
+          </w:p>
+        </w:tc>
+        <w:tc>
+          <w:tcPr>
+            <w:tcW w:type="dxa" w:w="2835"/>
+          </w:tcPr>
+          <w:p>
+            <w:r/>
+            <w:r>
+              <w:rPr>
+                <w:b w:val="0"/>
+                <w:i w:val="0"/>
+                <w:sz w:val="15"/>
+              </w:rPr>
+              <w:t>Upserts segments; everything else is keyed on these IDs</w:t>
+            </w:r>
+          </w:p>
+        </w:tc>
+      </w:tr>
+      <w:tr>
+        <w:tc>
+          <w:tcPr>
+            <w:tcW w:type="dxa" w:w="340"/>
+          </w:tcPr>
+          <w:p>
+            <w:r/>
+            <w:r>
+              <w:rPr>
+                <w:b w:val="0"/>
+                <w:i w:val="0"/>
+                <w:sz w:val="15"/>
+              </w:rPr>
+              <w:t>2</w:t>
+            </w:r>
+          </w:p>
+        </w:tc>
+        <w:tc>
+          <w:tcPr>
+            <w:tcW w:type="dxa" w:w="1701"/>
+          </w:tcPr>
+          <w:p>
+            <w:r/>
+            <w:r>
+              <w:rPr>
+                <w:b w:val="0"/>
+                <w:i w:val="0"/>
+                <w:sz w:val="15"/>
+              </w:rPr>
+              <w:t>Market (MAPSHistData)</w:t>
+            </w:r>
+          </w:p>
+        </w:tc>
+        <w:tc>
+          <w:tcPr>
+            <w:tcW w:type="dxa" w:w="1361"/>
+          </w:tcPr>
+          <w:p>
+            <w:r/>
+            <w:r>
+              <w:rPr>
+                <w:b w:val="0"/>
+                <w:i w:val="0"/>
+                <w:sz w:val="15"/>
+              </w:rPr>
+              <w:t>as exported</w:t>
+            </w:r>
+          </w:p>
+        </w:tc>
+        <w:tc>
+          <w:tcPr>
+            <w:tcW w:type="dxa" w:w="3402"/>
+          </w:tcPr>
+          <w:p>
+            <w:r/>
+            <w:r>
+              <w:rPr>
+                <w:b w:val="0"/>
+                <w:i w:val="0"/>
+                <w:sz w:val="15"/>
+              </w:rPr>
+              <w:t>Country, Micro Segment, Year, Market Planted Area (HA), Market Qty (KS), Market Avg Plant Density, Market AvgPrice (ExSeed)</w:t>
+            </w:r>
+          </w:p>
+        </w:tc>
+        <w:tc>
+          <w:tcPr>
+            <w:tcW w:type="dxa" w:w="2835"/>
+          </w:tcPr>
+          <w:p>
+            <w:r/>
+            <w:r>
+              <w:rPr>
+                <w:b w:val="0"/>
+                <w:i w:val="0"/>
+                <w:sz w:val="15"/>
+              </w:rPr>
+              <w:t>Replaces country/segment/year rows; latest Modified wins; warns if qty differs from ha x density</w:t>
+            </w:r>
+          </w:p>
+        </w:tc>
+      </w:tr>
+      <w:tr>
+        <w:tc>
+          <w:tcPr>
+            <w:tcW w:type="dxa" w:w="340"/>
+          </w:tcPr>
+          <w:p>
+            <w:r/>
+            <w:r>
+              <w:rPr>
+                <w:b w:val="0"/>
+                <w:i w:val="0"/>
+                <w:sz w:val="15"/>
+              </w:rPr>
+              <w:t>3</w:t>
+            </w:r>
+          </w:p>
+        </w:tc>
+        <w:tc>
+          <w:tcPr>
+            <w:tcW w:type="dxa" w:w="1701"/>
+          </w:tcPr>
+          <w:p>
+            <w:r/>
+            <w:r>
+              <w:rPr>
+                <w:b w:val="0"/>
+                <w:i w:val="0"/>
+                <w:sz w:val="15"/>
+              </w:rPr>
+              <w:t>Syngenta plan (Syngenta5YrsSales)</w:t>
+            </w:r>
+          </w:p>
+        </w:tc>
+        <w:tc>
+          <w:tcPr>
+            <w:tcW w:type="dxa" w:w="1361"/>
+          </w:tcPr>
+          <w:p>
+            <w:r/>
+            <w:r>
+              <w:rPr>
+                <w:b w:val="0"/>
+                <w:i w:val="0"/>
+                <w:sz w:val="15"/>
+              </w:rPr>
+              <w:t>as exported</w:t>
+            </w:r>
+          </w:p>
+        </w:tc>
+        <w:tc>
+          <w:tcPr>
+            <w:tcW w:type="dxa" w:w="3402"/>
+          </w:tcPr>
+          <w:p>
+            <w:r/>
+            <w:r>
+              <w:rPr>
+                <w:b w:val="0"/>
+                <w:i w:val="0"/>
+                <w:sz w:val="15"/>
+              </w:rPr>
+              <w:t>Title, Country, Microsegment ID, Sales Qty, Sales Value</w:t>
+            </w:r>
+          </w:p>
+        </w:tc>
+        <w:tc>
+          <w:tcPr>
+            <w:tcW w:type="dxa" w:w="2835"/>
+          </w:tcPr>
+          <w:p>
+            <w:r/>
+            <w:r>
+              <w:rPr>
+                <w:b w:val="0"/>
+                <w:i w:val="0"/>
+                <w:sz w:val="15"/>
+              </w:rPr>
+              <w:t>IDs recovered from descriptions; duplicates summed; net price = value / qty; rebuilds the monthly plan</w:t>
+            </w:r>
+          </w:p>
+        </w:tc>
+      </w:tr>
+      <w:tr>
+        <w:tc>
+          <w:tcPr>
+            <w:tcW w:type="dxa" w:w="340"/>
+          </w:tcPr>
+          <w:p>
+            <w:r/>
+            <w:r>
+              <w:rPr>
+                <w:b w:val="0"/>
+                <w:i w:val="0"/>
+                <w:sz w:val="15"/>
+              </w:rPr>
+              <w:t>4</w:t>
+            </w:r>
+          </w:p>
+        </w:tc>
+        <w:tc>
+          <w:tcPr>
+            <w:tcW w:type="dxa" w:w="1701"/>
+          </w:tcPr>
+          <w:p>
+            <w:r/>
+            <w:r>
+              <w:rPr>
+                <w:b w:val="0"/>
+                <w:i w:val="0"/>
+                <w:sz w:val="15"/>
+              </w:rPr>
+              <w:t>Competitor shares</w:t>
+            </w:r>
+          </w:p>
+        </w:tc>
+        <w:tc>
+          <w:tcPr>
+            <w:tcW w:type="dxa" w:w="1361"/>
+          </w:tcPr>
+          <w:p>
+            <w:r/>
+            <w:r>
+              <w:rPr>
+                <w:b w:val="0"/>
+                <w:i w:val="0"/>
+                <w:sz w:val="15"/>
+              </w:rPr>
+              <w:t>as exported</w:t>
+            </w:r>
+          </w:p>
+        </w:tc>
+        <w:tc>
+          <w:tcPr>
+            <w:tcW w:type="dxa" w:w="3402"/>
+          </w:tcPr>
+          <w:p>
+            <w:r/>
+            <w:r>
+              <w:rPr>
+                <w:b w:val="0"/>
+                <w:i w:val="0"/>
+                <w:sz w:val="15"/>
+              </w:rPr>
+              <w:t>Forecast Customer Country_D, Mega_Segment_Id, CompetitorDesc, YYYY%</w:t>
+            </w:r>
+          </w:p>
+        </w:tc>
+        <w:tc>
+          <w:tcPr>
+            <w:tcW w:type="dxa" w:w="2835"/>
+          </w:tcPr>
+          <w:p>
+            <w:r/>
+            <w:r>
+              <w:rPr>
+                <w:b w:val="0"/>
+                <w:i w:val="0"/>
+                <w:sz w:val="15"/>
+              </w:rPr>
+              <w:t>Replaces country/mega/year; warns when shares do not sum to 100</w:t>
+            </w:r>
+          </w:p>
+        </w:tc>
+      </w:tr>
+      <w:tr>
+        <w:tc>
+          <w:tcPr>
+            <w:tcW w:type="dxa" w:w="340"/>
+          </w:tcPr>
+          <w:p>
+            <w:r/>
+            <w:r>
+              <w:rPr>
+                <w:b w:val="0"/>
+                <w:i w:val="0"/>
+                <w:sz w:val="15"/>
+              </w:rPr>
+              <w:t>5</w:t>
+            </w:r>
+          </w:p>
+        </w:tc>
+        <w:tc>
+          <w:tcPr>
+            <w:tcW w:type="dxa" w:w="1701"/>
+          </w:tcPr>
+          <w:p>
+            <w:r/>
+            <w:r>
+              <w:rPr>
+                <w:b w:val="0"/>
+                <w:i w:val="0"/>
+                <w:sz w:val="15"/>
+              </w:rPr>
+              <w:t>Monthly actuals</w:t>
+            </w:r>
+          </w:p>
+        </w:tc>
+        <w:tc>
+          <w:tcPr>
+            <w:tcW w:type="dxa" w:w="1361"/>
+          </w:tcPr>
+          <w:p>
+            <w:r/>
+            <w:r>
+              <w:rPr>
+                <w:b w:val="0"/>
+                <w:i w:val="0"/>
+                <w:sz w:val="15"/>
+              </w:rPr>
+              <w:t>template</w:t>
+            </w:r>
+          </w:p>
+        </w:tc>
+        <w:tc>
+          <w:tcPr>
+            <w:tcW w:type="dxa" w:w="3402"/>
+          </w:tcPr>
+          <w:p>
+            <w:r/>
+            <w:r>
+              <w:rPr>
+                <w:b w:val="0"/>
+                <w:i w:val="0"/>
+                <w:sz w:val="15"/>
+              </w:rPr>
+              <w:t>country_code, micro_segment_id, year, month, sales_qty_ks (+ optional sales_value_eur)</w:t>
+            </w:r>
+          </w:p>
+        </w:tc>
+        <w:tc>
+          <w:tcPr>
+            <w:tcW w:type="dxa" w:w="2835"/>
+          </w:tcPr>
+          <w:p>
+            <w:r/>
+            <w:r>
+              <w:rPr>
+                <w:b w:val="0"/>
+                <w:i w:val="0"/>
+                <w:sz w:val="15"/>
+              </w:rPr>
+              <w:t>Closes those months, resolves due claims, recomputes track records</w:t>
+            </w:r>
+          </w:p>
+        </w:tc>
+      </w:tr>
+      <w:tr>
+        <w:tc>
+          <w:tcPr>
+            <w:tcW w:type="dxa" w:w="340"/>
+          </w:tcPr>
+          <w:p>
+            <w:r/>
+            <w:r>
+              <w:rPr>
+                <w:b w:val="0"/>
+                <w:i w:val="0"/>
+                <w:sz w:val="15"/>
+              </w:rPr>
+              <w:t>6</w:t>
+            </w:r>
+          </w:p>
+        </w:tc>
+        <w:tc>
+          <w:tcPr>
+            <w:tcW w:type="dxa" w:w="1701"/>
+          </w:tcPr>
+          <w:p>
+            <w:r/>
+            <w:r>
+              <w:rPr>
+                <w:b w:val="0"/>
+                <w:i w:val="0"/>
+                <w:sz w:val="15"/>
+              </w:rPr>
+              <w:t>Rep assignments</w:t>
+            </w:r>
+          </w:p>
+        </w:tc>
+        <w:tc>
+          <w:tcPr>
+            <w:tcW w:type="dxa" w:w="1361"/>
+          </w:tcPr>
+          <w:p>
+            <w:r/>
+            <w:r>
+              <w:rPr>
+                <w:b w:val="0"/>
+                <w:i w:val="0"/>
+                <w:sz w:val="15"/>
+              </w:rPr>
+              <w:t>template</w:t>
+            </w:r>
+          </w:p>
+        </w:tc>
+        <w:tc>
+          <w:tcPr>
+            <w:tcW w:type="dxa" w:w="3402"/>
+          </w:tcPr>
+          <w:p>
+            <w:r/>
+            <w:r>
+              <w:rPr>
+                <w:b w:val="0"/>
+                <w:i w:val="0"/>
+                <w:sz w:val="15"/>
+              </w:rPr>
+              <w:t>email, name, role, country_code, scope_type, scope_ids</w:t>
+            </w:r>
+          </w:p>
+        </w:tc>
+        <w:tc>
+          <w:tcPr>
+            <w:tcW w:type="dxa" w:w="2835"/>
+          </w:tcPr>
+          <w:p>
+            <w:r/>
+            <w:r>
+              <w:rPr>
+                <w:b w:val="0"/>
+                <w:i w:val="0"/>
+                <w:sz w:val="15"/>
+              </w:rPr>
+              <w:t>Upserts users and replaces their scopes</w:t>
+            </w:r>
+          </w:p>
+        </w:tc>
+      </w:tr>
+      <w:tr>
+        <w:tc>
+          <w:tcPr>
+            <w:tcW w:type="dxa" w:w="340"/>
+          </w:tcPr>
+          <w:p>
+            <w:r/>
+            <w:r>
+              <w:rPr>
+                <w:b w:val="0"/>
+                <w:i w:val="0"/>
+                <w:sz w:val="15"/>
+              </w:rPr>
+              <w:t>7</w:t>
+            </w:r>
+          </w:p>
+        </w:tc>
+        <w:tc>
+          <w:tcPr>
+            <w:tcW w:type="dxa" w:w="1701"/>
+          </w:tcPr>
+          <w:p>
+            <w:r/>
+            <w:r>
+              <w:rPr>
+                <w:b w:val="0"/>
+                <w:i w:val="0"/>
+                <w:sz w:val="15"/>
+              </w:rPr>
+              <w:t>Grower potential (optional)</w:t>
+            </w:r>
+          </w:p>
+        </w:tc>
+        <w:tc>
+          <w:tcPr>
+            <w:tcW w:type="dxa" w:w="1361"/>
+          </w:tcPr>
+          <w:p>
+            <w:r/>
+            <w:r>
+              <w:rPr>
+                <w:b w:val="0"/>
+                <w:i w:val="0"/>
+                <w:sz w:val="15"/>
+              </w:rPr>
+              <w:t>as exported</w:t>
+            </w:r>
+          </w:p>
+        </w:tc>
+        <w:tc>
+          <w:tcPr>
+            <w:tcW w:type="dxa" w:w="3402"/>
+          </w:tcPr>
+          <w:p>
+            <w:r/>
+            <w:r>
+              <w:rPr>
+                <w:b w:val="0"/>
+                <w:i w:val="0"/>
+                <w:sz w:val="15"/>
+              </w:rPr>
+              <w:t>Country Name, Crop Local, Hecatres Info.</w:t>
+            </w:r>
+          </w:p>
+        </w:tc>
+        <w:tc>
+          <w:tcPr>
+            <w:tcW w:type="dxa" w:w="2835"/>
+          </w:tcPr>
+          <w:p>
+            <w:r/>
+            <w:r>
+              <w:rPr>
+                <w:b w:val="0"/>
+                <w:i w:val="0"/>
+                <w:sz w:val="15"/>
+              </w:rPr>
+              <w:t>Caps rows at the hectare cap; feeds the ceiling flag and variety options</w:t>
+            </w:r>
+          </w:p>
+        </w:tc>
+      </w:tr>
+      <w:tr>
+        <w:tc>
+          <w:tcPr>
+            <w:tcW w:type="dxa" w:w="340"/>
+          </w:tcPr>
+          <w:p>
+            <w:r/>
+            <w:r>
+              <w:rPr>
+                <w:b w:val="0"/>
+                <w:i w:val="0"/>
+                <w:sz w:val="15"/>
+              </w:rPr>
+              <w:t>8</w:t>
+            </w:r>
+          </w:p>
+        </w:tc>
+        <w:tc>
+          <w:tcPr>
+            <w:tcW w:type="dxa" w:w="1701"/>
+          </w:tcPr>
+          <w:p>
+            <w:r/>
+            <w:r>
+              <w:rPr>
+                <w:b w:val="0"/>
+                <w:i w:val="0"/>
+                <w:sz w:val="15"/>
+              </w:rPr>
+              <w:t>Seasonality (optional)</w:t>
+            </w:r>
+          </w:p>
+        </w:tc>
+        <w:tc>
+          <w:tcPr>
+            <w:tcW w:type="dxa" w:w="1361"/>
+          </w:tcPr>
+          <w:p>
+            <w:r/>
+            <w:r>
+              <w:rPr>
+                <w:b w:val="0"/>
+                <w:i w:val="0"/>
+                <w:sz w:val="15"/>
+              </w:rPr>
+              <w:t>template</w:t>
+            </w:r>
+          </w:p>
+        </w:tc>
+        <w:tc>
+          <w:tcPr>
+            <w:tcW w:type="dxa" w:w="3402"/>
+          </w:tcPr>
+          <w:p>
+            <w:r/>
+            <w:r>
+              <w:rPr>
+                <w:b w:val="0"/>
+                <w:i w:val="0"/>
+                <w:sz w:val="15"/>
+              </w:rPr>
+              <w:t>country_code, micro_segment_id or mega_segment_id, month, weight</w:t>
+            </w:r>
+          </w:p>
+        </w:tc>
+        <w:tc>
+          <w:tcPr>
+            <w:tcW w:type="dxa" w:w="2835"/>
+          </w:tcPr>
+          <w:p>
+            <w:r/>
+            <w:r>
+              <w:rPr>
+                <w:b w:val="0"/>
+                <w:i w:val="0"/>
+                <w:sz w:val="15"/>
+              </w:rPr>
+              <w:t>Normalized per key; splits the yearly plan (else last two complete years of actuals, else flat)</w:t>
+            </w:r>
+          </w:p>
+        </w:tc>
+      </w:tr>
+    </w:tbl>
+    <w:p>
+      <w:pPr>
+        <w:spacing w:after="40"/>
+      </w:pPr>
+    </w:p>
+    <w:p>
+      <w:pPr>
+        <w:spacing w:after="120"/>
+      </w:pPr>
+      <w:r>
+        <w:rPr>
+          <w:b w:val="0"/>
+          <w:i w:val="0"/>
+        </w:rPr>
+        <w:t>Every upload becomes a preview batch showing rows read, accepted, rejected (with row number and reason) and warnings. Nothing changes until an admin commits; earlier committed batches for the same countries are marked superseded. Admins also manage users and scopes, and settings (planning year, thresholds, AI confidence levels, hectare cap, currency and the Jev switch).</w:t>
+      </w:r>
+    </w:p>
+    <w:p>
+      <w:pPr>
+        <w:pStyle w:val="Heading2"/>
+      </w:pPr>
+      <w:r>
+        <w:t>21.2 What reps enter</w:t>
+      </w:r>
+    </w:p>
+    <w:p>
+      <w:pPr>
+        <w:pStyle w:val="ListBullet"/>
+        <w:spacing w:after="40"/>
+      </w:pPr>
+      <w:r>
+        <w:rPr>
+          <w:b w:val="0"/>
+          <w:i w:val="0"/>
+        </w:rPr>
+        <w:t>Scope (country, crop, mega-segment) from the header; only segments in their scopes are editable.</w:t>
+      </w:r>
+    </w:p>
+    <w:p>
+      <w:pPr>
+        <w:pStyle w:val="ListBullet"/>
+        <w:spacing w:after="40"/>
+      </w:pPr>
+      <w:r>
+        <w:rPr>
+          <w:b w:val="0"/>
+          <w:i w:val="0"/>
+        </w:rPr>
+        <w:t>An open month: after the last month with uploaded actuals.</w:t>
+      </w:r>
+    </w:p>
+    <w:p>
+      <w:pPr>
+        <w:pStyle w:val="ListBullet"/>
+        <w:spacing w:after="40"/>
+      </w:pPr>
+      <w:r>
+        <w:rPr>
+          <w:b w:val="0"/>
+          <w:i w:val="0"/>
+        </w:rPr>
+        <w:t>Demand in thousand seeds, a low/high range, optional net price, and a justification of up to 600 characters (required when flagged).</w:t>
+      </w:r>
+    </w:p>
+    <w:p>
+      <w:pPr>
+        <w:pStyle w:val="Heading2"/>
+      </w:pPr>
+      <w:r>
+        <w:t>21.3 First run</w:t>
+      </w:r>
+    </w:p>
+    <w:p>
+      <w:pPr>
+        <w:pStyle w:val="ListNumber"/>
+        <w:spacing w:after="40"/>
+      </w:pPr>
+      <w:r>
+        <w:rPr>
+          <w:b w:val="0"/>
+          <w:i w:val="0"/>
+        </w:rPr>
+        <w:t>Firebase console: Authentication &gt; Get started &gt; enable Google sign-in.</w:t>
+      </w:r>
+    </w:p>
+    <w:p>
+      <w:pPr>
+        <w:pStyle w:val="ListNumber"/>
+        <w:spacing w:after="40"/>
+      </w:pPr>
+      <w:r>
+        <w:rPr>
+          <w:b w:val="0"/>
+          <w:i w:val="0"/>
+        </w:rPr>
+        <w:t>Authentication &gt; Settings &gt; Authorized domains: add skystream-real-842137351485.europe-west1.run.app.</w:t>
+      </w:r>
+    </w:p>
+    <w:p>
+      <w:pPr>
+        <w:pStyle w:val="ListNumber"/>
+        <w:spacing w:after="40"/>
+      </w:pPr>
+      <w:r>
+        <w:rPr>
+          <w:b w:val="0"/>
+          <w:i w:val="0"/>
+        </w:rPr>
+        <w:t>Sign in with a bootstrap admin email (BOOTSTRAP_ADMIN_EMAILS), upload the files in order, add reps and leads.</w:t>
+      </w:r>
+    </w:p>
+    <w:p>
+      <w:pPr>
+        <w:pStyle w:val="Heading1"/>
+      </w:pPr>
+      <w:r>
+        <w:t>22. Limitations, risks and next steps</w:t>
+      </w:r>
+    </w:p>
+    <w:p>
+      <w:pPr>
+        <w:spacing w:after="40"/>
+      </w:pPr>
+      <w:r>
+        <w:rPr>
+          <w:b/>
+          <w:sz w:val="18"/>
+        </w:rPr>
+        <w:t>Table 30. Limitations and next steps</w:t>
+      </w:r>
+    </w:p>
+    <w:tbl>
+      <w:tblPr>
+        <w:tblStyle w:val="LightGrid-Accent1"/>
+        <w:tblW w:type="auto" w:w="0"/>
+        <w:jc w:val="center"/>
+        <w:tblLook w:firstColumn="1" w:firstRow="1" w:lastColumn="0" w:lastRow="0" w:noHBand="0" w:noVBand="1" w:val="04A0"/>
+      </w:tblPr>
+      <w:tblGrid>
+        <w:gridCol w:w="3213"/>
+        <w:gridCol w:w="3213"/>
+        <w:gridCol w:w="3213"/>
+      </w:tblGrid>
+      <w:tr>
+        <w:tc>
+          <w:tcPr>
+            <w:tcW w:type="dxa" w:w="1701"/>
+          </w:tcPr>
+          <w:p>
+            <w:r/>
+            <w:r>
+              <w:rPr>
+                <w:b/>
+                <w:sz w:val="16"/>
+              </w:rPr>
+              <w:t>Area</w:t>
+            </w:r>
+          </w:p>
+        </w:tc>
+        <w:tc>
+          <w:tcPr>
+            <w:tcW w:type="dxa" w:w="3969"/>
+          </w:tcPr>
+          <w:p>
+            <w:r/>
+            <w:r>
+              <w:rPr>
+                <w:b/>
+                <w:sz w:val="16"/>
+              </w:rPr>
+              <w:t>Current state</w:t>
+            </w:r>
+          </w:p>
+        </w:tc>
+        <w:tc>
+          <w:tcPr>
+            <w:tcW w:type="dxa" w:w="3969"/>
+          </w:tcPr>
+          <w:p>
+            <w:r/>
+            <w:r>
+              <w:rPr>
+                <w:b/>
+                <w:sz w:val="16"/>
+              </w:rPr>
+              <w:t>Next step</w:t>
+            </w:r>
+          </w:p>
+        </w:tc>
+      </w:tr>
+      <w:tr>
+        <w:tc>
+          <w:tcPr>
+            <w:tcW w:type="dxa" w:w="1701"/>
+          </w:tcPr>
+          <w:p>
+            <w:r/>
+            <w:r>
+              <w:rPr>
+                <w:b w:val="0"/>
+                <w:i w:val="0"/>
+                <w:sz w:val="16"/>
+              </w:rPr>
+              <w:t>Authentication</w:t>
+            </w:r>
+          </w:p>
+        </w:tc>
+        <w:tc>
+          <w:tcPr>
+            <w:tcW w:type="dxa" w:w="3969"/>
+          </w:tcPr>
+          <w:p>
+            <w:r/>
+            <w:r>
+              <w:rPr>
+                <w:b w:val="0"/>
+                <w:i w:val="0"/>
+                <w:sz w:val="16"/>
+              </w:rPr>
+              <w:t>Demo: role switcher. Real: Firebase Google sign-in with registered users</w:t>
+            </w:r>
+          </w:p>
+        </w:tc>
+        <w:tc>
+          <w:tcPr>
+            <w:tcW w:type="dxa" w:w="3969"/>
+          </w:tcPr>
+          <w:p>
+            <w:r/>
+            <w:r>
+              <w:rPr>
+                <w:b w:val="0"/>
+                <w:i w:val="0"/>
+                <w:sz w:val="16"/>
+              </w:rPr>
+              <w:t>Company SSO (SAML/OIDC) through Identity Platform</w:t>
+            </w:r>
+          </w:p>
+        </w:tc>
+      </w:tr>
+      <w:tr>
+        <w:tc>
+          <w:tcPr>
+            <w:tcW w:type="dxa" w:w="1701"/>
+          </w:tcPr>
+          <w:p>
+            <w:r/>
+            <w:r>
+              <w:rPr>
+                <w:b w:val="0"/>
+                <w:i w:val="0"/>
+                <w:sz w:val="16"/>
+              </w:rPr>
+              <w:t>Persistence</w:t>
+            </w:r>
+          </w:p>
+        </w:tc>
+        <w:tc>
+          <w:tcPr>
+            <w:tcW w:type="dxa" w:w="3969"/>
+          </w:tcPr>
+          <w:p>
+            <w:r/>
+            <w:r>
+              <w:rPr>
+                <w:b w:val="0"/>
+                <w:i w:val="0"/>
+                <w:sz w:val="16"/>
+              </w:rPr>
+              <w:t>Demo: SQLite per instance. Real: Cloud SQL Postgres</w:t>
+            </w:r>
+          </w:p>
+        </w:tc>
+        <w:tc>
+          <w:tcPr>
+            <w:tcW w:type="dxa" w:w="3969"/>
+          </w:tcPr>
+          <w:p>
+            <w:r/>
+            <w:r>
+              <w:rPr>
+                <w:b w:val="0"/>
+                <w:i w:val="0"/>
+                <w:sz w:val="16"/>
+              </w:rPr>
+              <w:t>Point the demo at Postgres too if it must keep entries</w:t>
+            </w:r>
+          </w:p>
+        </w:tc>
+      </w:tr>
+      <w:tr>
+        <w:tc>
+          <w:tcPr>
+            <w:tcW w:type="dxa" w:w="1701"/>
+          </w:tcPr>
+          <w:p>
+            <w:r/>
+            <w:r>
+              <w:rPr>
+                <w:b w:val="0"/>
+                <w:i w:val="0"/>
+                <w:sz w:val="16"/>
+              </w:rPr>
+              <w:t>Monthly data</w:t>
+            </w:r>
+          </w:p>
+        </w:tc>
+        <w:tc>
+          <w:tcPr>
+            <w:tcW w:type="dxa" w:w="3969"/>
+          </w:tcPr>
+          <w:p>
+            <w:r/>
+            <w:r>
+              <w:rPr>
+                <w:b w:val="0"/>
+                <w:i w:val="0"/>
+                <w:sz w:val="16"/>
+              </w:rPr>
+              <w:t>Synthetic curves and actuals</w:t>
+            </w:r>
+          </w:p>
+        </w:tc>
+        <w:tc>
+          <w:tcPr>
+            <w:tcW w:type="dxa" w:w="3969"/>
+          </w:tcPr>
+          <w:p>
+            <w:r/>
+            <w:r>
+              <w:rPr>
+                <w:b w:val="0"/>
+                <w:i w:val="0"/>
+                <w:sz w:val="16"/>
+              </w:rPr>
+              <w:t>Confirm seasonality; load real monthly demand and year-to-date actuals</w:t>
+            </w:r>
+          </w:p>
+        </w:tc>
+      </w:tr>
+      <w:tr>
+        <w:tc>
+          <w:tcPr>
+            <w:tcW w:type="dxa" w:w="1701"/>
+          </w:tcPr>
+          <w:p>
+            <w:r/>
+            <w:r>
+              <w:rPr>
+                <w:b w:val="0"/>
+                <w:i w:val="0"/>
+                <w:sz w:val="16"/>
+              </w:rPr>
+              <w:t>Claim signals</w:t>
+            </w:r>
+          </w:p>
+        </w:tc>
+        <w:tc>
+          <w:tcPr>
+            <w:tcW w:type="dxa" w:w="3969"/>
+          </w:tcPr>
+          <w:p>
+            <w:r/>
+            <w:r>
+              <w:rPr>
+                <w:b w:val="0"/>
+                <w:i w:val="0"/>
+                <w:sz w:val="16"/>
+              </w:rPr>
+              <w:t>Competitor and hectare claims checked against monthly sales</w:t>
+            </w:r>
+          </w:p>
+        </w:tc>
+        <w:tc>
+          <w:tcPr>
+            <w:tcW w:type="dxa" w:w="3969"/>
+          </w:tcPr>
+          <w:p>
+            <w:r/>
+            <w:r>
+              <w:rPr>
+                <w:b w:val="0"/>
+                <w:i w:val="0"/>
+                <w:sz w:val="16"/>
+              </w:rPr>
+              <w:t>Add competitor-share and MAPA/ESYRCE hectare feeds</w:t>
+            </w:r>
+          </w:p>
+        </w:tc>
+      </w:tr>
+      <w:tr>
+        <w:tc>
+          <w:tcPr>
+            <w:tcW w:type="dxa" w:w="1701"/>
+          </w:tcPr>
+          <w:p>
+            <w:r/>
+            <w:r>
+              <w:rPr>
+                <w:b w:val="0"/>
+                <w:i w:val="0"/>
+                <w:sz w:val="16"/>
+              </w:rPr>
+              <w:t>Jev</w:t>
+            </w:r>
+          </w:p>
+        </w:tc>
+        <w:tc>
+          <w:tcPr>
+            <w:tcW w:type="dxa" w:w="3969"/>
+          </w:tcPr>
+          <w:p>
+            <w:r/>
+            <w:r>
+              <w:rPr>
+                <w:b w:val="0"/>
+                <w:i w:val="0"/>
+                <w:sz w:val="16"/>
+              </w:rPr>
+              <w:t>Early-access model; confidence gating + Gemini fallback + offline decider</w:t>
+            </w:r>
+          </w:p>
+        </w:tc>
+        <w:tc>
+          <w:tcPr>
+            <w:tcW w:type="dxa" w:w="3969"/>
+          </w:tcPr>
+          <w:p>
+            <w:r/>
+            <w:r>
+              <w:rPr>
+                <w:b w:val="0"/>
+                <w:i w:val="0"/>
+                <w:sz w:val="16"/>
+              </w:rPr>
+              <w:t>Record fixtures for demos; tune option wording and 0.8 threshold on labelled examples</w:t>
+            </w:r>
+          </w:p>
+        </w:tc>
+      </w:tr>
+      <w:tr>
+        <w:tc>
+          <w:tcPr>
+            <w:tcW w:type="dxa" w:w="1701"/>
+          </w:tcPr>
+          <w:p>
+            <w:r/>
+            <w:r>
+              <w:rPr>
+                <w:b w:val="0"/>
+                <w:i w:val="0"/>
+                <w:sz w:val="16"/>
+              </w:rPr>
+              <w:t>Thresholds</w:t>
+            </w:r>
+          </w:p>
+        </w:tc>
+        <w:tc>
+          <w:tcPr>
+            <w:tcW w:type="dxa" w:w="3969"/>
+          </w:tcPr>
+          <w:p>
+            <w:r/>
+            <w:r>
+              <w:rPr>
+                <w:b w:val="0"/>
+                <w:i w:val="0"/>
+                <w:sz w:val="16"/>
+              </w:rPr>
+              <w:t>Defaults (10 pts, 2 sigma, 30% range, 70% price share)</w:t>
+            </w:r>
+          </w:p>
+        </w:tc>
+        <w:tc>
+          <w:tcPr>
+            <w:tcW w:type="dxa" w:w="3969"/>
+          </w:tcPr>
+          <w:p>
+            <w:r/>
+            <w:r>
+              <w:rPr>
+                <w:b w:val="0"/>
+                <w:i w:val="0"/>
+                <w:sz w:val="16"/>
+              </w:rPr>
+              <w:t>Calibrate with the SMEs</w:t>
+            </w:r>
+          </w:p>
+        </w:tc>
+      </w:tr>
+      <w:tr>
+        <w:tc>
+          <w:tcPr>
+            <w:tcW w:type="dxa" w:w="1701"/>
+          </w:tcPr>
+          <w:p>
+            <w:r/>
+            <w:r>
+              <w:rPr>
+                <w:b w:val="0"/>
+                <w:i w:val="0"/>
+                <w:sz w:val="16"/>
+              </w:rPr>
+              <w:t>Scope</w:t>
+            </w:r>
+          </w:p>
+        </w:tc>
+        <w:tc>
+          <w:tcPr>
+            <w:tcW w:type="dxa" w:w="3969"/>
+          </w:tcPr>
+          <w:p>
+            <w:r/>
+            <w:r>
+              <w:rPr>
+                <w:b w:val="0"/>
+                <w:i w:val="0"/>
+                <w:sz w:val="16"/>
+              </w:rPr>
+              <w:t>One crop, one country</w:t>
+            </w:r>
+          </w:p>
+        </w:tc>
+        <w:tc>
+          <w:tcPr>
+            <w:tcW w:type="dxa" w:w="3969"/>
+          </w:tcPr>
+          <w:p>
+            <w:r/>
+            <w:r>
+              <w:rPr>
+                <w:b w:val="0"/>
+                <w:i w:val="0"/>
+                <w:sz w:val="16"/>
+              </w:rPr>
+              <w:t>Territory roll-up and more crops after the MVP</w:t>
+            </w:r>
+          </w:p>
+        </w:tc>
+      </w:tr>
+    </w:tbl>
+    <w:p>
+      <w:pPr>
+        <w:spacing w:after="40"/>
+      </w:pPr>
+    </w:p>
+    <w:p>
+      <w:pPr>
+        <w:pStyle w:val="Heading2"/>
+      </w:pPr>
+      <w:r>
+        <w:t>22.1 Open questions for the SMEs</w:t>
       </w:r>
     </w:p>
     <w:p>
@@ -18250,7 +19525,7 @@
         <w:pStyle w:val="Heading1"/>
       </w:pPr>
       <w:r>
-        <w:t>22. Glossary</w:t>
+        <w:t>23. Glossary</w:t>
       </w:r>
     </w:p>
     <w:p>
@@ -18262,7 +19537,7 @@
           <w:b/>
           <w:sz w:val="18"/>
         </w:rPr>
-        <w:t>Table 29. Terms</w:t>
+        <w:t>Table 31. Terms</w:t>
       </w:r>
     </w:p>
     <w:tbl>

</xml_diff>

<commit_message>
Implement lead rules feature with backend support and API integration. Added new database schema for lead rules, updated decision provider and lead rules evaluation logic, and created API endpoints for rule management. Enhanced documentation in CLAUDE.md and README.md to reflect new functionalities. Updated relevant services and schemas to accommodate lead rules processing and validation.
</commit_message>
<xml_diff>
--- a/docs/Defensible_Demand_Ledger.docx
+++ b/docs/Defensible_Demand_Ledger.docx
@@ -4254,7 +4254,7 @@
       <w:r>
         <w:drawing>
           <wp:inline xmlns:a="http://schemas.openxmlformats.org/drawingml/2006/main" xmlns:pic="http://schemas.openxmlformats.org/drawingml/2006/picture">
-            <wp:extent cx="6120000" cy="5265750"/>
+            <wp:extent cx="6120000" cy="6290000"/>
             <wp:docPr id="1" name="Picture 1"/>
             <wp:cNvGraphicFramePr>
               <a:graphicFrameLocks noChangeAspect="1"/>
@@ -4275,7 +4275,7 @@
                   <pic:spPr>
                     <a:xfrm>
                       <a:off x="0" y="0"/>
-                      <a:ext cx="6120000" cy="5265750"/>
+                      <a:ext cx="6120000" cy="6290000"/>
                     </a:xfrm>
                     <a:prstGeom prst="rect"/>
                   </pic:spPr>
@@ -4500,7 +4500,7 @@
       <w:r>
         <w:drawing>
           <wp:inline xmlns:a="http://schemas.openxmlformats.org/drawingml/2006/main" xmlns:pic="http://schemas.openxmlformats.org/drawingml/2006/picture">
-            <wp:extent cx="6120000" cy="5350750"/>
+            <wp:extent cx="6120000" cy="6477000"/>
             <wp:docPr id="2" name="Picture 2"/>
             <wp:cNvGraphicFramePr>
               <a:graphicFrameLocks noChangeAspect="1"/>
@@ -4521,7 +4521,7 @@
                   <pic:spPr>
                     <a:xfrm>
                       <a:off x="0" y="0"/>
-                      <a:ext cx="6120000" cy="5350750"/>
+                      <a:ext cx="6120000" cy="6477000"/>
                     </a:xfrm>
                     <a:prstGeom prst="rect"/>
                   </pic:spPr>
@@ -4584,7 +4584,7 @@
       <w:r>
         <w:drawing>
           <wp:inline xmlns:a="http://schemas.openxmlformats.org/drawingml/2006/main" xmlns:pic="http://schemas.openxmlformats.org/drawingml/2006/picture">
-            <wp:extent cx="6120000" cy="6290000"/>
+            <wp:extent cx="6120000" cy="7310000"/>
             <wp:docPr id="3" name="Picture 3"/>
             <wp:cNvGraphicFramePr>
               <a:graphicFrameLocks noChangeAspect="1"/>
@@ -4605,7 +4605,7 @@
                   <pic:spPr>
                     <a:xfrm>
                       <a:off x="0" y="0"/>
-                      <a:ext cx="6120000" cy="6290000"/>
+                      <a:ext cx="6120000" cy="7310000"/>
                     </a:xfrm>
                     <a:prstGeom prst="rect"/>
                   </pic:spPr>
@@ -7842,6 +7842,88 @@
                 <w:i w:val="0"/>
                 <w:sz w:val="15"/>
               </w:rPr>
+              <w:t>share_jump</w:t>
+            </w:r>
+          </w:p>
+        </w:tc>
+        <w:tc>
+          <w:tcPr>
+            <w:tcW w:type="dxa" w:w="907"/>
+          </w:tcPr>
+          <w:p>
+            <w:r/>
+            <w:r>
+              <w:rPr>
+                <w:b w:val="0"/>
+                <w:i w:val="0"/>
+                <w:sz w:val="15"/>
+              </w:rPr>
+              <w:t>warning</w:t>
+            </w:r>
+          </w:p>
+        </w:tc>
+        <w:tc>
+          <w:tcPr>
+            <w:tcW w:type="dxa" w:w="2381"/>
+          </w:tcPr>
+          <w:p>
+            <w:r/>
+            <w:r>
+              <w:rPr>
+                <w:b w:val="0"/>
+                <w:i w:val="0"/>
+                <w:sz w:val="15"/>
+              </w:rPr>
+              <w:t>One entry moves full-year share far from the current baseline (plan or submitted month)</w:t>
+            </w:r>
+          </w:p>
+        </w:tc>
+        <w:tc>
+          <w:tcPr>
+            <w:tcW w:type="dxa" w:w="2041"/>
+          </w:tcPr>
+          <w:p>
+            <w:r/>
+            <w:r>
+              <w:rPr>
+                <w:b w:val="0"/>
+                <w:i w:val="0"/>
+                <w:sz w:val="15"/>
+              </w:rPr>
+              <w:t>&gt; 10 pts either way (Admin setting)</w:t>
+            </w:r>
+          </w:p>
+        </w:tc>
+        <w:tc>
+          <w:tcPr>
+            <w:tcW w:type="dxa" w:w="2551"/>
+          </w:tcPr>
+          <w:p>
+            <w:r/>
+            <w:r>
+              <w:rPr>
+                <w:b w:val="0"/>
+                <w:i w:val="0"/>
+                <w:sz w:val="15"/>
+              </w:rPr>
+              <w:t>The storyboard copilot message: 'This entry is X% above the historical October average ... and lifts share from 20.2% to 35.0%'.</w:t>
+            </w:r>
+          </w:p>
+        </w:tc>
+      </w:tr>
+      <w:tr>
+        <w:tc>
+          <w:tcPr>
+            <w:tcW w:type="dxa" w:w="1757"/>
+          </w:tcPr>
+          <w:p>
+            <w:r/>
+            <w:r>
+              <w:rPr>
+                <w:b w:val="0"/>
+                <w:i w:val="0"/>
+                <w:sz w:val="15"/>
+              </w:rPr>
               <w:t>implied_ha_over_market</w:t>
             </w:r>
           </w:p>
@@ -8620,6 +8702,477 @@
           <w:i w:val="0"/>
         </w:rPr>
         <w:t>Competitor shares in the re-split never go below 0%: if Syngenta's implied value would exceed the whole Blocky PGH market, every competitor shows 0% and the share tile says the number exceeds the market.</w:t>
+      </w:r>
+    </w:p>
+    <w:p>
+      <w:pPr>
+        <w:spacing w:after="120"/>
+      </w:pPr>
+      <w:r>
+        <w:rPr>
+          <w:b w:val="0"/>
+          <w:i w:val="0"/>
+        </w:rPr>
+        <w:t>The historical average used in share_jump and month_outlier messages is the same month across earlier years: full actuals where all 12 months are loaded, otherwise that year's phased plan. The Capture screen shows the same benchmarks in a Baseline panel before the rep types: share by year with the average and high, the month's plan, last year and historical average, and planted area, implied hectares and CRM grower potential.</w:t>
+      </w:r>
+    </w:p>
+    <w:p>
+      <w:pPr>
+        <w:pStyle w:val="Heading2"/>
+      </w:pPr>
+      <w:r>
+        <w:t>9.1 Lead rules</w:t>
+      </w:r>
+    </w:p>
+    <w:p>
+      <w:pPr>
+        <w:spacing w:after="120"/>
+      </w:pPr>
+      <w:r>
+        <w:rPr>
+          <w:b w:val="0"/>
+          <w:i w:val="0"/>
+        </w:rPr>
+        <w:t>When a claim is contradicted by actuals, the consensus lead can write a rule in plain language, from the missed entry in the Ledger or on the Lead rules page. The rule becomes a fixed check that runs on every keystroke next to the flags above (lead_rules.py and leadRules.ts, held to lead_rule_cases.json).</w:t>
+      </w:r>
+    </w:p>
+    <w:p>
+      <w:pPr>
+        <w:spacing w:after="40"/>
+      </w:pPr>
+      <w:r>
+        <w:rPr>
+          <w:b/>
+          <w:sz w:val="18"/>
+        </w:rPr>
+        <w:t>Table 11. How a lead's sentence becomes a rule</w:t>
+      </w:r>
+    </w:p>
+    <w:tbl>
+      <w:tblPr>
+        <w:tblStyle w:val="LightGrid-Accent1"/>
+        <w:tblW w:type="auto" w:w="0"/>
+        <w:jc w:val="center"/>
+        <w:tblLook w:firstColumn="1" w:firstRow="1" w:lastColumn="0" w:lastRow="0" w:noHBand="0" w:noVBand="1" w:val="04A0"/>
+      </w:tblPr>
+      <w:tblGrid>
+        <w:gridCol w:w="3213"/>
+        <w:gridCol w:w="3213"/>
+        <w:gridCol w:w="3213"/>
+      </w:tblGrid>
+      <w:tr>
+        <w:tc>
+          <w:tcPr>
+            <w:tcW w:type="dxa" w:w="1701"/>
+          </w:tcPr>
+          <w:p>
+            <w:r/>
+            <w:r>
+              <w:rPr>
+                <w:b/>
+                <w:sz w:val="16"/>
+              </w:rPr>
+              <w:t>Slot</w:t>
+            </w:r>
+          </w:p>
+        </w:tc>
+        <w:tc>
+          <w:tcPr>
+            <w:tcW w:type="dxa" w:w="2608"/>
+          </w:tcPr>
+          <w:p>
+            <w:r/>
+            <w:r>
+              <w:rPr>
+                <w:b/>
+                <w:sz w:val="16"/>
+              </w:rPr>
+              <w:t>Filled by</w:t>
+            </w:r>
+          </w:p>
+        </w:tc>
+        <w:tc>
+          <w:tcPr>
+            <w:tcW w:type="dxa" w:w="5329"/>
+          </w:tcPr>
+          <w:p>
+            <w:r/>
+            <w:r>
+              <w:rPr>
+                <w:b/>
+                <w:sz w:val="16"/>
+              </w:rPr>
+              <w:t>Options</w:t>
+            </w:r>
+          </w:p>
+        </w:tc>
+      </w:tr>
+      <w:tr>
+        <w:tc>
+          <w:tcPr>
+            <w:tcW w:type="dxa" w:w="1701"/>
+          </w:tcPr>
+          <w:p>
+            <w:r/>
+            <w:r>
+              <w:rPr>
+                <w:b w:val="0"/>
+                <w:i w:val="0"/>
+                <w:sz w:val="16"/>
+              </w:rPr>
+              <w:t>Measure</w:t>
+            </w:r>
+          </w:p>
+        </w:tc>
+        <w:tc>
+          <w:tcPr>
+            <w:tcW w:type="dxa" w:w="2608"/>
+          </w:tcPr>
+          <w:p>
+            <w:r/>
+            <w:r>
+              <w:rPr>
+                <w:b w:val="0"/>
+                <w:i w:val="0"/>
+                <w:sz w:val="16"/>
+              </w:rPr>
+              <w:t>Jev (Gemini fallback, offline decider)</w:t>
+            </w:r>
+          </w:p>
+        </w:tc>
+        <w:tc>
+          <w:tcPr>
+            <w:tcW w:type="dxa" w:w="5329"/>
+          </w:tcPr>
+          <w:p>
+            <w:r/>
+            <w:r>
+              <w:rPr>
+                <w:b w:val="0"/>
+                <w:i w:val="0"/>
+                <w:sz w:val="16"/>
+              </w:rPr>
+              <w:t>month vs last year, vs plan, vs historical average; share level; share jump; range width; price vs plan; or unsupported (rejected)</w:t>
+            </w:r>
+          </w:p>
+        </w:tc>
+      </w:tr>
+      <w:tr>
+        <w:tc>
+          <w:tcPr>
+            <w:tcW w:type="dxa" w:w="1701"/>
+          </w:tcPr>
+          <w:p>
+            <w:r/>
+            <w:r>
+              <w:rPr>
+                <w:b w:val="0"/>
+                <w:i w:val="0"/>
+                <w:sz w:val="16"/>
+              </w:rPr>
+              <w:t>Direction</w:t>
+            </w:r>
+          </w:p>
+        </w:tc>
+        <w:tc>
+          <w:tcPr>
+            <w:tcW w:type="dxa" w:w="2608"/>
+          </w:tcPr>
+          <w:p>
+            <w:r/>
+            <w:r>
+              <w:rPr>
+                <w:b w:val="0"/>
+                <w:i w:val="0"/>
+                <w:sz w:val="16"/>
+              </w:rPr>
+              <w:t>Jev</w:t>
+            </w:r>
+          </w:p>
+        </w:tc>
+        <w:tc>
+          <w:tcPr>
+            <w:tcW w:type="dxa" w:w="5329"/>
+          </w:tcPr>
+          <w:p>
+            <w:r/>
+            <w:r>
+              <w:rPr>
+                <w:b w:val="0"/>
+                <w:i w:val="0"/>
+                <w:sz w:val="16"/>
+              </w:rPr>
+              <w:t>above / below</w:t>
+            </w:r>
+          </w:p>
+        </w:tc>
+      </w:tr>
+      <w:tr>
+        <w:tc>
+          <w:tcPr>
+            <w:tcW w:type="dxa" w:w="1701"/>
+          </w:tcPr>
+          <w:p>
+            <w:r/>
+            <w:r>
+              <w:rPr>
+                <w:b w:val="0"/>
+                <w:i w:val="0"/>
+                <w:sz w:val="16"/>
+              </w:rPr>
+              <w:t>Scope</w:t>
+            </w:r>
+          </w:p>
+        </w:tc>
+        <w:tc>
+          <w:tcPr>
+            <w:tcW w:type="dxa" w:w="2608"/>
+          </w:tcPr>
+          <w:p>
+            <w:r/>
+            <w:r>
+              <w:rPr>
+                <w:b w:val="0"/>
+                <w:i w:val="0"/>
+                <w:sz w:val="16"/>
+              </w:rPr>
+              <w:t>Jev</w:t>
+            </w:r>
+          </w:p>
+        </w:tc>
+        <w:tc>
+          <w:tcPr>
+            <w:tcW w:type="dxa" w:w="5329"/>
+          </w:tcPr>
+          <w:p>
+            <w:r/>
+            <w:r>
+              <w:rPr>
+                <w:b w:val="0"/>
+                <w:i w:val="0"/>
+                <w:sz w:val="16"/>
+              </w:rPr>
+              <w:t>the missed entry's micro-segment, or the whole mega-segment</w:t>
+            </w:r>
+          </w:p>
+        </w:tc>
+      </w:tr>
+      <w:tr>
+        <w:tc>
+          <w:tcPr>
+            <w:tcW w:type="dxa" w:w="1701"/>
+          </w:tcPr>
+          <w:p>
+            <w:r/>
+            <w:r>
+              <w:rPr>
+                <w:b w:val="0"/>
+                <w:i w:val="0"/>
+                <w:sz w:val="16"/>
+              </w:rPr>
+              <w:t>Required reason</w:t>
+            </w:r>
+          </w:p>
+        </w:tc>
+        <w:tc>
+          <w:tcPr>
+            <w:tcW w:type="dxa" w:w="2608"/>
+          </w:tcPr>
+          <w:p>
+            <w:r/>
+            <w:r>
+              <w:rPr>
+                <w:b w:val="0"/>
+                <w:i w:val="0"/>
+                <w:sz w:val="16"/>
+              </w:rPr>
+              <w:t>Jev</w:t>
+            </w:r>
+          </w:p>
+        </w:tc>
+        <w:tc>
+          <w:tcPr>
+            <w:tcW w:type="dxa" w:w="5329"/>
+          </w:tcPr>
+          <w:p>
+            <w:r/>
+            <w:r>
+              <w:rPr>
+                <w:b w:val="0"/>
+                <w:i w:val="0"/>
+                <w:sz w:val="16"/>
+              </w:rPr>
+              <w:t>one of the justification drivers, or none</w:t>
+            </w:r>
+          </w:p>
+        </w:tc>
+      </w:tr>
+      <w:tr>
+        <w:tc>
+          <w:tcPr>
+            <w:tcW w:type="dxa" w:w="1701"/>
+          </w:tcPr>
+          <w:p>
+            <w:r/>
+            <w:r>
+              <w:rPr>
+                <w:b w:val="0"/>
+                <w:i w:val="0"/>
+                <w:sz w:val="16"/>
+              </w:rPr>
+              <w:t>Severity</w:t>
+            </w:r>
+          </w:p>
+        </w:tc>
+        <w:tc>
+          <w:tcPr>
+            <w:tcW w:type="dxa" w:w="2608"/>
+          </w:tcPr>
+          <w:p>
+            <w:r/>
+            <w:r>
+              <w:rPr>
+                <w:b w:val="0"/>
+                <w:i w:val="0"/>
+                <w:sz w:val="16"/>
+              </w:rPr>
+              <w:t>Jev</w:t>
+            </w:r>
+          </w:p>
+        </w:tc>
+        <w:tc>
+          <w:tcPr>
+            <w:tcW w:type="dxa" w:w="5329"/>
+          </w:tcPr>
+          <w:p>
+            <w:r/>
+            <w:r>
+              <w:rPr>
+                <w:b w:val="0"/>
+                <w:i w:val="0"/>
+                <w:sz w:val="16"/>
+              </w:rPr>
+              <w:t>warning, or critical (hard stop)</w:t>
+            </w:r>
+          </w:p>
+        </w:tc>
+      </w:tr>
+      <w:tr>
+        <w:tc>
+          <w:tcPr>
+            <w:tcW w:type="dxa" w:w="1701"/>
+          </w:tcPr>
+          <w:p>
+            <w:r/>
+            <w:r>
+              <w:rPr>
+                <w:b w:val="0"/>
+                <w:i w:val="0"/>
+                <w:sz w:val="16"/>
+              </w:rPr>
+              <w:t>Limit</w:t>
+            </w:r>
+          </w:p>
+        </w:tc>
+        <w:tc>
+          <w:tcPr>
+            <w:tcW w:type="dxa" w:w="2608"/>
+          </w:tcPr>
+          <w:p>
+            <w:r/>
+            <w:r>
+              <w:rPr>
+                <w:b w:val="0"/>
+                <w:i w:val="0"/>
+                <w:sz w:val="16"/>
+              </w:rPr>
+              <w:t>Parsed from the text</w:t>
+            </w:r>
+          </w:p>
+        </w:tc>
+        <w:tc>
+          <w:tcPr>
+            <w:tcW w:type="dxa" w:w="5329"/>
+          </w:tcPr>
+          <w:p>
+            <w:r/>
+            <w:r>
+              <w:rPr>
+                <w:b w:val="0"/>
+                <w:i w:val="0"/>
+                <w:sz w:val="16"/>
+              </w:rPr>
+              <w:t>e.g. 20%, 10 pts; a rule without a number is rejected</w:t>
+            </w:r>
+          </w:p>
+        </w:tc>
+      </w:tr>
+      <w:tr>
+        <w:tc>
+          <w:tcPr>
+            <w:tcW w:type="dxa" w:w="1701"/>
+          </w:tcPr>
+          <w:p>
+            <w:r/>
+            <w:r>
+              <w:rPr>
+                <w:b w:val="0"/>
+                <w:i w:val="0"/>
+                <w:sz w:val="16"/>
+              </w:rPr>
+              <w:t>Months</w:t>
+            </w:r>
+          </w:p>
+        </w:tc>
+        <w:tc>
+          <w:tcPr>
+            <w:tcW w:type="dxa" w:w="2608"/>
+          </w:tcPr>
+          <w:p>
+            <w:r/>
+            <w:r>
+              <w:rPr>
+                <w:b w:val="0"/>
+                <w:i w:val="0"/>
+                <w:sz w:val="16"/>
+              </w:rPr>
+              <w:t>Parsed from the text</w:t>
+            </w:r>
+          </w:p>
+        </w:tc>
+        <w:tc>
+          <w:tcPr>
+            <w:tcW w:type="dxa" w:w="5329"/>
+          </w:tcPr>
+          <w:p>
+            <w:r/>
+            <w:r>
+              <w:rPr>
+                <w:b w:val="0"/>
+                <w:i w:val="0"/>
+                <w:sz w:val="16"/>
+              </w:rPr>
+              <w:t>month names, ranges (Oct-Dec), seasons, quarters; none means every month</w:t>
+            </w:r>
+          </w:p>
+        </w:tc>
+      </w:tr>
+    </w:tbl>
+    <w:p>
+      <w:pPr>
+        <w:spacing w:after="40"/>
+      </w:pPr>
+    </w:p>
+    <w:p>
+      <w:pPr>
+        <w:spacing w:after="120"/>
+      </w:pPr>
+      <w:r>
+        <w:rPr>
+          <w:b w:val="0"/>
+          <w:i w:val="0"/>
+        </w:rPr>
+        <w:t>Before activating, the lead sees a plain read-back and a backtest over every recorded entry in scope (how often the rule would have fired, how those claims resolved, and whether it would have caught the miss). A fired rule with a required reason adds a critical lead_rule_&lt;id&gt;_unmet flag on submit when the structured claim gives a different driver. Rules keep their author, sentence, source entry and provider; the Rules page shows how often each fired and how those entries resolved, and leads can retire them.</w:t>
       </w:r>
     </w:p>
     <w:p>
@@ -8751,7 +9304,7 @@
           <w:b/>
           <w:sz w:val="18"/>
         </w:rPr>
-        <w:t>Table 11. Justification questions</w:t>
+        <w:t>Table 12. Justification questions</w:t>
       </w:r>
     </w:p>
     <w:tbl>
@@ -9646,7 +10199,7 @@
           <w:b/>
           <w:sz w:val="18"/>
         </w:rPr>
-        <w:t>Table 12. Resolution</w:t>
+        <w:t>Table 13. Resolution</w:t>
       </w:r>
     </w:p>
     <w:tbl>
@@ -9940,7 +10493,7 @@
           <w:b/>
           <w:sz w:val="18"/>
         </w:rPr>
-        <w:t>Table 13. AI modes</w:t>
+        <w:t>Table 14. AI modes</w:t>
       </w:r>
     </w:p>
     <w:tbl>
@@ -10150,7 +10703,7 @@
           <w:b/>
           <w:sz w:val="18"/>
         </w:rPr>
-        <w:t>Table 14. Workbooks and tabs</w:t>
+        <w:t>Table 15. Workbooks and tabs</w:t>
       </w:r>
     </w:p>
     <w:tbl>
@@ -10916,7 +11469,7 @@
           <w:b/>
           <w:sz w:val="18"/>
         </w:rPr>
-        <w:t>Table 15. Market elements used</w:t>
+        <w:t>Table 16. Market elements used</w:t>
       </w:r>
     </w:p>
     <w:tbl>
@@ -11701,7 +12254,7 @@
           <w:b/>
           <w:sz w:val="18"/>
         </w:rPr>
-        <w:t>Table 16. Sales elements used</w:t>
+        <w:t>Table 17. Sales elements used</w:t>
       </w:r>
     </w:p>
     <w:tbl>
@@ -12236,7 +12789,7 @@
           <w:b/>
           <w:sz w:val="18"/>
         </w:rPr>
-        <w:t>Table 17. Competitor elements used</w:t>
+        <w:t>Table 18. Competitor elements used</w:t>
       </w:r>
     </w:p>
     <w:tbl>
@@ -12571,7 +13124,7 @@
           <w:b/>
           <w:sz w:val="18"/>
         </w:rPr>
-        <w:t>Table 18. Grower-potential elements used</w:t>
+        <w:t>Table 19. Grower-potential elements used</w:t>
       </w:r>
     </w:p>
     <w:tbl>
@@ -13056,7 +13609,7 @@
           <w:b/>
           <w:sz w:val="18"/>
         </w:rPr>
-        <w:t>Table 19. Hierarchy elements used (tab: prod hierarchy)</w:t>
+        <w:t>Table 20. Hierarchy elements used (tab: prod hierarchy)</w:t>
       </w:r>
     </w:p>
     <w:tbl>
@@ -13491,7 +14044,7 @@
           <w:b/>
           <w:sz w:val="18"/>
         </w:rPr>
-        <w:t>Table 20. Geo elements used</w:t>
+        <w:t>Table 21. Geo elements used</w:t>
       </w:r>
     </w:p>
     <w:tbl>
@@ -13676,7 +14229,7 @@
           <w:b/>
           <w:sz w:val="18"/>
         </w:rPr>
-        <w:t>Table 21. Unused columns and why</w:t>
+        <w:t>Table 22. Unused columns and why</w:t>
       </w:r>
     </w:p>
     <w:tbl>
@@ -14061,7 +14614,7 @@
           <w:b/>
           <w:sz w:val="18"/>
         </w:rPr>
-        <w:t>Table 22. Data-quality findings (from ingest_report.json)</w:t>
+        <w:t>Table 23. Data-quality findings (from ingest_report.json)</w:t>
       </w:r>
     </w:p>
     <w:tbl>
@@ -14808,7 +15361,7 @@
           <w:b/>
           <w:sz w:val="18"/>
         </w:rPr>
-        <w:t>Table 23. Synthetic layers</w:t>
+        <w:t>Table 24. Synthetic layers</w:t>
       </w:r>
     </w:p>
     <w:tbl>
@@ -15243,7 +15796,7 @@
           <w:b/>
           <w:sz w:val="18"/>
         </w:rPr>
-        <w:t>Table 24. Derived elements</w:t>
+        <w:t>Table 25. Derived elements</w:t>
       </w:r>
     </w:p>
     <w:tbl>
@@ -15783,7 +16336,7 @@
           <w:b/>
           <w:sz w:val="18"/>
         </w:rPr>
-        <w:t>Table 25. Tables (one Alembic migration)</w:t>
+        <w:t>Table 26. Tables (one Alembic migration)</w:t>
       </w:r>
     </w:p>
     <w:tbl>
@@ -16341,6 +16894,56 @@
                 <w:sz w:val="15"/>
               </w:rPr>
               <w:t>Materialized on advance</w:t>
+            </w:r>
+          </w:p>
+        </w:tc>
+      </w:tr>
+      <w:tr>
+        <w:tc>
+          <w:tcPr>
+            <w:tcW w:type="dxa" w:w="1814"/>
+          </w:tcPr>
+          <w:p>
+            <w:r/>
+            <w:r>
+              <w:rPr>
+                <w:b w:val="0"/>
+                <w:i w:val="0"/>
+                <w:sz w:val="15"/>
+              </w:rPr>
+              <w:t>lead_rules</w:t>
+            </w:r>
+          </w:p>
+        </w:tc>
+        <w:tc>
+          <w:tcPr>
+            <w:tcW w:type="dxa" w:w="5443"/>
+          </w:tcPr>
+          <w:p>
+            <w:r/>
+            <w:r>
+              <w:rPr>
+                <w:b w:val="0"/>
+                <w:i w:val="0"/>
+                <w:sz w:val="15"/>
+              </w:rPr>
+              <w:t>country_code, mega_segment_id, segment_ids, months, metric, comparator, threshold, required_driver, severity, text, description, decisions, provider, source_entry_id, created_by/at, active, retired_by/at</w:t>
+            </w:r>
+          </w:p>
+        </w:tc>
+        <w:tc>
+          <w:tcPr>
+            <w:tcW w:type="dxa" w:w="2381"/>
+          </w:tcPr>
+          <w:p>
+            <w:r/>
+            <w:r>
+              <w:rPr>
+                <w:b w:val="0"/>
+                <w:i w:val="0"/>
+                <w:sz w:val="15"/>
+              </w:rPr>
+              <w:t>Lessons from missed claims</w:t>
             </w:r>
           </w:p>
         </w:tc>
@@ -16418,7 +17021,7 @@
           <w:b/>
           <w:sz w:val="18"/>
         </w:rPr>
-        <w:t>Table 26. Endpoints</w:t>
+        <w:t>Table 27. Endpoints</w:t>
       </w:r>
     </w:p>
     <w:tbl>
@@ -17126,6 +17729,206 @@
                 <w:sz w:val="16"/>
               </w:rPr>
               <w:t>Reasons-to-believe draft (Gemini or template)</w:t>
+            </w:r>
+          </w:p>
+        </w:tc>
+      </w:tr>
+      <w:tr>
+        <w:tc>
+          <w:tcPr>
+            <w:tcW w:type="dxa" w:w="3515"/>
+          </w:tcPr>
+          <w:p>
+            <w:r/>
+            <w:r>
+              <w:rPr>
+                <w:b w:val="0"/>
+                <w:i w:val="0"/>
+                <w:sz w:val="16"/>
+              </w:rPr>
+              <w:t>GET /api/rules</w:t>
+            </w:r>
+          </w:p>
+        </w:tc>
+        <w:tc>
+          <w:tcPr>
+            <w:tcW w:type="dxa" w:w="1361"/>
+          </w:tcPr>
+          <w:p>
+            <w:r/>
+            <w:r>
+              <w:rPr>
+                <w:b w:val="0"/>
+                <w:i w:val="0"/>
+                <w:sz w:val="16"/>
+              </w:rPr>
+              <w:t>-</w:t>
+            </w:r>
+          </w:p>
+        </w:tc>
+        <w:tc>
+          <w:tcPr>
+            <w:tcW w:type="dxa" w:w="4762"/>
+          </w:tcPr>
+          <w:p>
+            <w:r/>
+            <w:r>
+              <w:rPr>
+                <w:b w:val="0"/>
+                <w:i w:val="0"/>
+                <w:sz w:val="16"/>
+              </w:rPr>
+              <w:t>Lead rules for a scope, with how often each fired and how those entries resolved</w:t>
+            </w:r>
+          </w:p>
+        </w:tc>
+      </w:tr>
+      <w:tr>
+        <w:tc>
+          <w:tcPr>
+            <w:tcW w:type="dxa" w:w="3515"/>
+          </w:tcPr>
+          <w:p>
+            <w:r/>
+            <w:r>
+              <w:rPr>
+                <w:b w:val="0"/>
+                <w:i w:val="0"/>
+                <w:sz w:val="16"/>
+              </w:rPr>
+              <w:t>POST /api/rules/compile</w:t>
+            </w:r>
+          </w:p>
+        </w:tc>
+        <w:tc>
+          <w:tcPr>
+            <w:tcW w:type="dxa" w:w="1361"/>
+          </w:tcPr>
+          <w:p>
+            <w:r/>
+            <w:r>
+              <w:rPr>
+                <w:b w:val="0"/>
+                <w:i w:val="0"/>
+                <w:sz w:val="16"/>
+              </w:rPr>
+              <w:t>lead/admin</w:t>
+            </w:r>
+          </w:p>
+        </w:tc>
+        <w:tc>
+          <w:tcPr>
+            <w:tcW w:type="dxa" w:w="4762"/>
+          </w:tcPr>
+          <w:p>
+            <w:r/>
+            <w:r>
+              <w:rPr>
+                <w:b w:val="0"/>
+                <w:i w:val="0"/>
+                <w:sz w:val="16"/>
+              </w:rPr>
+              <w:t>Read a sentence into rule slots, read-back and backtest</w:t>
+            </w:r>
+          </w:p>
+        </w:tc>
+      </w:tr>
+      <w:tr>
+        <w:tc>
+          <w:tcPr>
+            <w:tcW w:type="dxa" w:w="3515"/>
+          </w:tcPr>
+          <w:p>
+            <w:r/>
+            <w:r>
+              <w:rPr>
+                <w:b w:val="0"/>
+                <w:i w:val="0"/>
+                <w:sz w:val="16"/>
+              </w:rPr>
+              <w:t>POST /api/rules</w:t>
+            </w:r>
+          </w:p>
+        </w:tc>
+        <w:tc>
+          <w:tcPr>
+            <w:tcW w:type="dxa" w:w="1361"/>
+          </w:tcPr>
+          <w:p>
+            <w:r/>
+            <w:r>
+              <w:rPr>
+                <w:b w:val="0"/>
+                <w:i w:val="0"/>
+                <w:sz w:val="16"/>
+              </w:rPr>
+              <w:t>lead/admin</w:t>
+            </w:r>
+          </w:p>
+        </w:tc>
+        <w:tc>
+          <w:tcPr>
+            <w:tcW w:type="dxa" w:w="4762"/>
+          </w:tcPr>
+          <w:p>
+            <w:r/>
+            <w:r>
+              <w:rPr>
+                <w:b w:val="0"/>
+                <w:i w:val="0"/>
+                <w:sz w:val="16"/>
+              </w:rPr>
+              <w:t>Activate a rule (slots validated server-side)</w:t>
+            </w:r>
+          </w:p>
+        </w:tc>
+      </w:tr>
+      <w:tr>
+        <w:tc>
+          <w:tcPr>
+            <w:tcW w:type="dxa" w:w="3515"/>
+          </w:tcPr>
+          <w:p>
+            <w:r/>
+            <w:r>
+              <w:rPr>
+                <w:b w:val="0"/>
+                <w:i w:val="0"/>
+                <w:sz w:val="16"/>
+              </w:rPr>
+              <w:t>POST /api/rules/{id}/retire</w:t>
+            </w:r>
+          </w:p>
+        </w:tc>
+        <w:tc>
+          <w:tcPr>
+            <w:tcW w:type="dxa" w:w="1361"/>
+          </w:tcPr>
+          <w:p>
+            <w:r/>
+            <w:r>
+              <w:rPr>
+                <w:b w:val="0"/>
+                <w:i w:val="0"/>
+                <w:sz w:val="16"/>
+              </w:rPr>
+              <w:t>lead/admin</w:t>
+            </w:r>
+          </w:p>
+        </w:tc>
+        <w:tc>
+          <w:tcPr>
+            <w:tcW w:type="dxa" w:w="4762"/>
+          </w:tcPr>
+          <w:p>
+            <w:r/>
+            <w:r>
+              <w:rPr>
+                <w:b w:val="0"/>
+                <w:i w:val="0"/>
+                <w:sz w:val="16"/>
+              </w:rPr>
+              <w:t>Retire a rule</w:t>
             </w:r>
           </w:p>
         </w:tc>
@@ -17253,7 +18056,7 @@
           <w:b/>
           <w:sz w:val="18"/>
         </w:rPr>
-        <w:t>Table 27. Production configuration</w:t>
+        <w:t>Table 28. Production configuration</w:t>
       </w:r>
     </w:p>
     <w:tbl>
@@ -17740,7 +18543,7 @@
           <w:b/>
           <w:sz w:val="18"/>
         </w:rPr>
-        <w:t>Table 28. Modes</w:t>
+        <w:t>Table 29. Modes</w:t>
       </w:r>
     </w:p>
     <w:tbl>
@@ -18124,7 +18927,7 @@
           <w:b/>
           <w:sz w:val="18"/>
         </w:rPr>
-        <w:t>Table 29. Uploads, in load order</w:t>
+        <w:t>Table 30. Uploads, in load order</w:t>
       </w:r>
     </w:p>
     <w:tbl>
@@ -19003,7 +19806,7 @@
           <w:b/>
           <w:sz w:val="18"/>
         </w:rPr>
-        <w:t>Table 30. Limitations and next steps</w:t>
+        <w:t>Table 31. Limitations and next steps</w:t>
       </w:r>
     </w:p>
     <w:tbl>
@@ -19537,7 +20340,7 @@
           <w:b/>
           <w:sz w:val="18"/>
         </w:rPr>
-        <w:t>Table 31. Terms</w:t>
+        <w:t>Table 32. Terms</w:t>
       </w:r>
     </w:p>
     <w:tbl>

</xml_diff>